<commit_message>
update feature description with character
</commit_message>
<xml_diff>
--- a/Báo cáo THXDHTTT.docx
+++ b/Báo cáo THXDHTTT.docx
@@ -3,58 +3,68 @@
 <w:document xmlns:wpc="http://schemas.microsoft.com/office/word/2010/wordprocessingCanvas" xmlns:cx="http://schemas.microsoft.com/office/drawing/2014/chartex" xmlns:cx1="http://schemas.microsoft.com/office/drawing/2015/9/8/chartex" xmlns:cx2="http://schemas.microsoft.com/office/drawing/2015/10/21/chartex" xmlns:cx3="http://schemas.microsoft.com/office/drawing/2016/5/9/chartex" xmlns:cx4="http://schemas.microsoft.com/office/drawing/2016/5/10/chartex" xmlns:cx5="http://schemas.microsoft.com/office/drawing/2016/5/11/chartex" xmlns:cx6="http://schemas.microsoft.com/office/drawing/2016/5/12/chartex" xmlns:cx7="http://schemas.microsoft.com/office/drawing/2016/5/13/chartex" xmlns:cx8="http://schemas.microsoft.com/office/drawing/2016/5/14/chartex" xmlns:mc="http://schemas.openxmlformats.org/markup-compatibility/2006" xmlns:aink="http://schemas.microsoft.com/office/drawing/2016/ink" xmlns:am3d="http://schemas.microsoft.com/office/drawing/2017/model3d" xmlns:o="urn:schemas-microsoft-com:office:office" xmlns:oel="http://schemas.microsoft.com/office/2019/extlst" xmlns:r="http://schemas.openxmlformats.org/officeDocument/2006/relationships" xmlns:m="http://schemas.openxmlformats.org/officeDocument/2006/math" xmlns:v="urn:schemas-microsoft-com:vml" xmlns:wp14="http://schemas.microsoft.com/office/word/2010/wordprocessingDrawing" xmlns:wp="http://schemas.openxmlformats.org/drawingml/2006/wordprocessingDrawing" xmlns:w10="urn:schemas-microsoft-com:office:word" xmlns:w="http://schemas.openxmlformats.org/wordprocessingml/2006/main" xmlns:w14="http://schemas.microsoft.com/office/word/2010/wordml" xmlns:w15="http://schemas.microsoft.com/office/word/2012/wordml" xmlns:w16cex="http://schemas.microsoft.com/office/word/2018/wordml/cex" xmlns:w16cid="http://schemas.microsoft.com/office/word/2016/wordml/cid" xmlns:w16="http://schemas.microsoft.com/office/word/2018/wordml" xmlns:w16du="http://schemas.microsoft.com/office/word/2023/wordml/word16du" xmlns:w16sdtdh="http://schemas.microsoft.com/office/word/2020/wordml/sdtdatahash" xmlns:w16sdtfl="http://schemas.microsoft.com/office/word/2024/wordml/sdtformatlock" xmlns:w16se="http://schemas.microsoft.com/office/word/2015/wordml/symex" xmlns:wpg="http://schemas.microsoft.com/office/word/2010/wordprocessingGroup" xmlns:wpi="http://schemas.microsoft.com/office/word/2010/wordprocessingInk" xmlns:wne="http://schemas.microsoft.com/office/word/2006/wordml" xmlns:wps="http://schemas.microsoft.com/office/word/2010/wordprocessingShape" mc:Ignorable="w14 w15 w16se w16cid w16 w16cex w16sdtdh w16sdtfl w16du wp14">
   <w:body>
     <w:p>
-      <w:r>
-        <w:br/>
-        <w:t>Model</w:t>
-      </w:r>
-    </w:p>
-    <w:p>
-      <w:r>
-        <w:t>Chắc chắn rồi. Dưới đây là một cấu trúc báo cáo chi tiết và chuyên nghiệp về mô hình gợi ý ngành học của bạn. Bạn có thể dựa vào đây để phát triển thành một bài báo cáo hoàn chỉnh, phù hợp với mục đích sử dụng (báo cáo đồ án, thuyết trình, tài liệu dự án).</w:t>
-      </w:r>
-    </w:p>
-    <w:p>
-      <w:r>
-        <w:pict w14:anchorId="04DB8156">
-          <v:rect id="_x0000_i1061" style="width:664.2pt;height:1.5pt" o:hrpct="0" o:hralign="center" o:hrstd="t" o:hr="t" fillcolor="#a0a0a0" stroked="f"/>
-        </w:pict>
-      </w:r>
-    </w:p>
-    <w:p>
-      <w:pPr>
-        <w:rPr>
+      <w:pPr>
+        <w:spacing w:before="120" w:after="120" w:line="360" w:lineRule="auto"/>
+        <w:jc w:val="center"/>
+        <w:rPr>
+          <w:rFonts w:ascii="Times New Roman" w:hAnsi="Times New Roman" w:cs="Times New Roman"/>
           <w:b/>
           <w:bCs/>
-        </w:rPr>
-      </w:pPr>
-      <w:r>
-        <w:rPr>
+          <w:sz w:val="26"/>
+          <w:szCs w:val="26"/>
+        </w:rPr>
+      </w:pPr>
+      <w:r>
+        <w:rPr>
+          <w:rFonts w:ascii="Times New Roman" w:hAnsi="Times New Roman" w:cs="Times New Roman"/>
           <w:b/>
           <w:bCs/>
+          <w:sz w:val="26"/>
+          <w:szCs w:val="26"/>
         </w:rPr>
         <w:t>BÁO CÁO DỰ ÁN: XÂY DỰNG HỆ THỐNG GỢI Ý NGÀNH HỌC DỰA TRÊN TRẮC NGHIỆM TÍNH CÁCH RIASEC VÀ TIPI</w:t>
       </w:r>
     </w:p>
     <w:p>
-      <w:r>
-        <w:pict w14:anchorId="73FD663A">
-          <v:rect id="_x0000_i1062" style="width:664.2pt;height:1.5pt" o:hrpct="0" o:hralign="center" o:hrstd="t" o:hr="t" fillcolor="#a0a0a0" stroked="f"/>
-        </w:pict>
-      </w:r>
-    </w:p>
-    <w:p>
-      <w:pPr>
-        <w:rPr>
+      <w:pPr>
+        <w:spacing w:before="120" w:after="120" w:line="360" w:lineRule="auto"/>
+        <w:rPr>
+          <w:rFonts w:ascii="Times New Roman" w:hAnsi="Times New Roman" w:cs="Times New Roman"/>
           <w:b/>
           <w:bCs/>
-        </w:rPr>
-      </w:pPr>
-      <w:r>
-        <w:rPr>
+          <w:sz w:val="26"/>
+          <w:szCs w:val="26"/>
+        </w:rPr>
+      </w:pPr>
+      <w:r>
+        <w:rPr>
+          <w:rFonts w:ascii="Times New Roman" w:hAnsi="Times New Roman" w:cs="Times New Roman"/>
           <w:b/>
           <w:bCs/>
+          <w:sz w:val="26"/>
+          <w:szCs w:val="26"/>
         </w:rPr>
         <w:t>1. TỔNG QUAN VÀ MỤC TIÊU</w:t>
+      </w:r>
+    </w:p>
+    <w:p>
+      <w:pPr>
+        <w:spacing w:before="120" w:after="120" w:line="360" w:lineRule="auto"/>
+        <w:rPr>
+          <w:rFonts w:ascii="Times New Roman" w:hAnsi="Times New Roman" w:cs="Times New Roman"/>
+          <w:sz w:val="26"/>
+          <w:szCs w:val="26"/>
+        </w:rPr>
+      </w:pPr>
+      <w:r>
+        <w:rPr>
+          <w:rFonts w:ascii="Times New Roman" w:hAnsi="Times New Roman" w:cs="Times New Roman"/>
+          <w:b/>
+          <w:bCs/>
+          <w:sz w:val="26"/>
+          <w:szCs w:val="26"/>
+        </w:rPr>
+        <w:t>1.1. Bối cảnh:</w:t>
       </w:r>
     </w:p>
     <w:p>
@@ -63,35 +73,20 @@
           <w:ilvl w:val="0"/>
           <w:numId w:val="1"/>
         </w:numPr>
-      </w:pPr>
-      <w:r>
-        <w:rPr>
-          <w:b/>
-          <w:bCs/>
-        </w:rPr>
-        <w:t>1.1. Bối cảnh:</w:t>
-      </w:r>
-    </w:p>
-    <w:p>
-      <w:pPr>
-        <w:numPr>
-          <w:ilvl w:val="1"/>
-          <w:numId w:val="1"/>
-        </w:numPr>
-      </w:pPr>
-      <w:r>
+        <w:spacing w:before="120" w:after="120" w:line="360" w:lineRule="auto"/>
+        <w:rPr>
+          <w:rFonts w:ascii="Times New Roman" w:hAnsi="Times New Roman" w:cs="Times New Roman"/>
+          <w:sz w:val="26"/>
+          <w:szCs w:val="26"/>
+        </w:rPr>
+      </w:pPr>
+      <w:r>
+        <w:rPr>
+          <w:rFonts w:ascii="Times New Roman" w:hAnsi="Times New Roman" w:cs="Times New Roman"/>
+          <w:sz w:val="26"/>
+          <w:szCs w:val="26"/>
+        </w:rPr>
         <w:t>Việc lựa chọn ngành học là một quyết định quan trọng đối với học sinh, sinh viên, nhưng thường gặp nhiều khó khăn do thiếu thông tin và định hướng.</w:t>
-      </w:r>
-    </w:p>
-    <w:p>
-      <w:pPr>
-        <w:numPr>
-          <w:ilvl w:val="1"/>
-          <w:numId w:val="1"/>
-        </w:numPr>
-      </w:pPr>
-      <w:r>
-        <w:t>Các bài trắc nghiệm tính cách hướng nghiệp như Holland Code (RIASEC) và Big Five (TIPI) là những công cụ khoa học, cung cấp cái nhìn sâu sắc về sự phù hợp giữa tính cách cá nhân và môi trường làm việc.</w:t>
       </w:r>
     </w:p>
     <w:p>
@@ -100,11 +95,38 @@
           <w:ilvl w:val="0"/>
           <w:numId w:val="1"/>
         </w:numPr>
-      </w:pPr>
-      <w:r>
-        <w:rPr>
+        <w:spacing w:before="120" w:after="120" w:line="360" w:lineRule="auto"/>
+        <w:rPr>
+          <w:rFonts w:ascii="Times New Roman" w:hAnsi="Times New Roman" w:cs="Times New Roman"/>
+          <w:sz w:val="26"/>
+          <w:szCs w:val="26"/>
+        </w:rPr>
+      </w:pPr>
+      <w:r>
+        <w:rPr>
+          <w:rFonts w:ascii="Times New Roman" w:hAnsi="Times New Roman" w:cs="Times New Roman"/>
+          <w:sz w:val="26"/>
+          <w:szCs w:val="26"/>
+        </w:rPr>
+        <w:t>Các bài trắc nghiệm tính cách hướng nghiệp như Holland Code (RIASEC) và Big Five (TIPI) là những công cụ khoa học, cung cấp cái nhìn sâu sắc về sự phù hợp giữa tính cách cá nhân và môi trường làm việc.</w:t>
+      </w:r>
+    </w:p>
+    <w:p>
+      <w:pPr>
+        <w:spacing w:before="120" w:after="120" w:line="360" w:lineRule="auto"/>
+        <w:rPr>
+          <w:rFonts w:ascii="Times New Roman" w:hAnsi="Times New Roman" w:cs="Times New Roman"/>
+          <w:sz w:val="26"/>
+          <w:szCs w:val="26"/>
+        </w:rPr>
+      </w:pPr>
+      <w:r>
+        <w:rPr>
+          <w:rFonts w:ascii="Times New Roman" w:hAnsi="Times New Roman" w:cs="Times New Roman"/>
           <w:b/>
           <w:bCs/>
+          <w:sz w:val="26"/>
+          <w:szCs w:val="26"/>
         </w:rPr>
         <w:t>1.2. Mục tiêu dự án:</w:t>
       </w:r>
@@ -112,86 +134,911 @@
     <w:p>
       <w:pPr>
         <w:numPr>
-          <w:ilvl w:val="1"/>
+          <w:ilvl w:val="0"/>
           <w:numId w:val="1"/>
         </w:numPr>
-      </w:pPr>
-      <w:r>
+        <w:spacing w:before="120" w:after="120" w:line="360" w:lineRule="auto"/>
+        <w:rPr>
+          <w:rFonts w:ascii="Times New Roman" w:hAnsi="Times New Roman" w:cs="Times New Roman"/>
+          <w:sz w:val="26"/>
+          <w:szCs w:val="26"/>
+        </w:rPr>
+      </w:pPr>
+      <w:r>
+        <w:rPr>
+          <w:rFonts w:ascii="Times New Roman" w:hAnsi="Times New Roman" w:cs="Times New Roman"/>
+          <w:sz w:val="26"/>
+          <w:szCs w:val="26"/>
+        </w:rPr>
         <w:t>Xây dựng một mô hình Học máy (Machine Learning) có khả năng </w:t>
       </w:r>
       <w:r>
         <w:rPr>
+          <w:rFonts w:ascii="Times New Roman" w:hAnsi="Times New Roman" w:cs="Times New Roman"/>
           <w:b/>
           <w:bCs/>
+          <w:sz w:val="26"/>
+          <w:szCs w:val="26"/>
         </w:rPr>
         <w:t>gợi ý một danh sách các ngành học phù hợp</w:t>
       </w:r>
       <w:r>
+        <w:rPr>
+          <w:rFonts w:ascii="Times New Roman" w:hAnsi="Times New Roman" w:cs="Times New Roman"/>
+          <w:sz w:val="26"/>
+          <w:szCs w:val="26"/>
+        </w:rPr>
         <w:t> cho người dùng dựa trên kết quả trắc nghiệm tính cách của họ.</w:t>
       </w:r>
     </w:p>
     <w:p>
       <w:pPr>
         <w:numPr>
-          <w:ilvl w:val="1"/>
+          <w:ilvl w:val="0"/>
           <w:numId w:val="1"/>
         </w:numPr>
-      </w:pPr>
-      <w:r>
+        <w:spacing w:before="120" w:after="120" w:line="360" w:lineRule="auto"/>
+        <w:rPr>
+          <w:rFonts w:ascii="Times New Roman" w:hAnsi="Times New Roman" w:cs="Times New Roman"/>
+          <w:sz w:val="26"/>
+          <w:szCs w:val="26"/>
+        </w:rPr>
+      </w:pPr>
+      <w:r>
+        <w:rPr>
+          <w:rFonts w:ascii="Times New Roman" w:hAnsi="Times New Roman" w:cs="Times New Roman"/>
+          <w:sz w:val="26"/>
+          <w:szCs w:val="26"/>
+        </w:rPr>
         <w:t>Mục tiêu không phải là dự đoán chính xác tuyệt đối một ngành, mà là cung cấp một </w:t>
       </w:r>
       <w:r>
         <w:rPr>
+          <w:rFonts w:ascii="Times New Roman" w:hAnsi="Times New Roman" w:cs="Times New Roman"/>
           <w:b/>
           <w:bCs/>
+          <w:sz w:val="26"/>
+          <w:szCs w:val="26"/>
         </w:rPr>
         <w:t>công cụ tư vấn và khám phá</w:t>
       </w:r>
       <w:r>
+        <w:rPr>
+          <w:rFonts w:ascii="Times New Roman" w:hAnsi="Times New Roman" w:cs="Times New Roman"/>
+          <w:sz w:val="26"/>
+          <w:szCs w:val="26"/>
+        </w:rPr>
         <w:t>, giúp người dùng mở rộng tầm nhìn và đưa ra quyết định tốt hơn.</w:t>
       </w:r>
     </w:p>
     <w:p>
       <w:pPr>
         <w:numPr>
-          <w:ilvl w:val="1"/>
+          <w:ilvl w:val="0"/>
           <w:numId w:val="1"/>
         </w:numPr>
-      </w:pPr>
-      <w:r>
+        <w:spacing w:before="120" w:after="120" w:line="360" w:lineRule="auto"/>
+        <w:rPr>
+          <w:rFonts w:ascii="Times New Roman" w:hAnsi="Times New Roman" w:cs="Times New Roman"/>
+          <w:sz w:val="26"/>
+          <w:szCs w:val="26"/>
+        </w:rPr>
+      </w:pPr>
+      <w:r>
+        <w:rPr>
+          <w:rFonts w:ascii="Times New Roman" w:hAnsi="Times New Roman" w:cs="Times New Roman"/>
+          <w:sz w:val="26"/>
+          <w:szCs w:val="26"/>
+        </w:rPr>
         <w:t>Giải quyết thách thức kỹ thuật chính là xử lý bộ dữ liệu có </w:t>
       </w:r>
       <w:r>
         <w:rPr>
+          <w:rFonts w:ascii="Times New Roman" w:hAnsi="Times New Roman" w:cs="Times New Roman"/>
           <w:b/>
           <w:bCs/>
+          <w:sz w:val="26"/>
+          <w:szCs w:val="26"/>
         </w:rPr>
         <w:t>số lượng lớn các ngành học (nhãn) và sự mất cân bằng dữ liệu nghiêm trọng</w:t>
       </w:r>
       <w:r>
+        <w:rPr>
+          <w:rFonts w:ascii="Times New Roman" w:hAnsi="Times New Roman" w:cs="Times New Roman"/>
+          <w:sz w:val="26"/>
+          <w:szCs w:val="26"/>
+        </w:rPr>
         <w:t>.</w:t>
       </w:r>
     </w:p>
     <w:p>
-      <w:r>
-        <w:pict w14:anchorId="5B47C2CB">
-          <v:rect id="_x0000_i1063" style="width:664.2pt;height:1.5pt" o:hrpct="0" o:hralign="center" o:hrstd="t" o:hr="t" fillcolor="#a0a0a0" stroked="f"/>
-        </w:pict>
-      </w:r>
-    </w:p>
-    <w:p>
-      <w:pPr>
-        <w:rPr>
+      <w:pPr>
+        <w:spacing w:before="120" w:after="120" w:line="360" w:lineRule="auto"/>
+        <w:rPr>
+          <w:rFonts w:ascii="Times New Roman" w:hAnsi="Times New Roman" w:cs="Times New Roman"/>
           <w:b/>
           <w:bCs/>
-        </w:rPr>
-      </w:pPr>
-      <w:r>
-        <w:rPr>
+          <w:sz w:val="26"/>
+          <w:szCs w:val="26"/>
+        </w:rPr>
+      </w:pPr>
+      <w:r>
+        <w:rPr>
+          <w:rFonts w:ascii="Times New Roman" w:hAnsi="Times New Roman" w:cs="Times New Roman"/>
           <w:b/>
           <w:bCs/>
+          <w:sz w:val="26"/>
+          <w:szCs w:val="26"/>
         </w:rPr>
         <w:t>2. DỮ LIỆU VÀ TIỀN XỬ LÝ</w:t>
+      </w:r>
+    </w:p>
+    <w:p>
+      <w:pPr>
+        <w:spacing w:before="120" w:after="120" w:line="360" w:lineRule="auto"/>
+        <w:rPr>
+          <w:rFonts w:ascii="Times New Roman" w:hAnsi="Times New Roman" w:cs="Times New Roman"/>
+          <w:sz w:val="26"/>
+          <w:szCs w:val="26"/>
+        </w:rPr>
+      </w:pPr>
+      <w:r>
+        <w:rPr>
+          <w:rFonts w:ascii="Times New Roman" w:hAnsi="Times New Roman" w:cs="Times New Roman"/>
+          <w:b/>
+          <w:bCs/>
+          <w:sz w:val="26"/>
+          <w:szCs w:val="26"/>
+        </w:rPr>
+        <w:t>2.1. Mô tả dữ liệu:</w:t>
+      </w:r>
+    </w:p>
+    <w:p>
+      <w:pPr>
+        <w:spacing w:before="120" w:after="120" w:line="360" w:lineRule="auto"/>
+        <w:ind w:left="360"/>
+        <w:rPr>
+          <w:rFonts w:ascii="Times New Roman" w:hAnsi="Times New Roman" w:cs="Times New Roman"/>
+          <w:sz w:val="26"/>
+          <w:szCs w:val="26"/>
+        </w:rPr>
+      </w:pPr>
+      <w:r>
+        <w:rPr>
+          <w:rFonts w:ascii="Times New Roman" w:hAnsi="Times New Roman" w:cs="Times New Roman"/>
+          <w:sz w:val="26"/>
+          <w:szCs w:val="26"/>
+        </w:rPr>
+        <w:t xml:space="preserve">Dữ liệu được thu thập </w:t>
+      </w:r>
+      <w:r>
+        <w:rPr>
+          <w:rFonts w:ascii="Times New Roman" w:hAnsi="Times New Roman" w:cs="Times New Roman"/>
+          <w:sz w:val="26"/>
+          <w:szCs w:val="26"/>
+        </w:rPr>
+        <w:t>từ</w:t>
+      </w:r>
+      <w:r>
+        <w:rPr>
+          <w:rFonts w:ascii="Times New Roman" w:hAnsi="Times New Roman" w:cs="Times New Roman"/>
+          <w:sz w:val="26"/>
+          <w:szCs w:val="26"/>
+        </w:rPr>
+        <w:t xml:space="preserve"> kaggle: </w:t>
+      </w:r>
+      <w:hyperlink r:id="rId5" w:history="1">
+        <w:r>
+          <w:rPr>
+            <w:rStyle w:val="Hyperlink"/>
+            <w:rFonts w:ascii="Times New Roman" w:hAnsi="Times New Roman" w:cs="Times New Roman"/>
+            <w:sz w:val="26"/>
+            <w:szCs w:val="26"/>
+          </w:rPr>
+          <w:t>https://www.kaggle.com/datasets/lucasgreenwell/holland-code-riasec-test-responses</w:t>
+        </w:r>
+      </w:hyperlink>
+    </w:p>
+    <w:p>
+      <w:pPr>
+        <w:pStyle w:val="ListParagraph"/>
+        <w:numPr>
+          <w:ilvl w:val="0"/>
+          <w:numId w:val="7"/>
+        </w:numPr>
+        <w:spacing w:before="120" w:after="120" w:line="360" w:lineRule="auto"/>
+        <w:rPr>
+          <w:rFonts w:ascii="Times New Roman" w:hAnsi="Times New Roman" w:cs="Times New Roman"/>
+          <w:sz w:val="26"/>
+          <w:szCs w:val="26"/>
+        </w:rPr>
+      </w:pPr>
+      <w:r>
+        <w:rPr>
+          <w:rFonts w:ascii="Times New Roman" w:hAnsi="Times New Roman" w:cs="Times New Roman"/>
+          <w:sz w:val="26"/>
+          <w:szCs w:val="26"/>
+        </w:rPr>
+        <w:t>Dữ liệu được thu thập vào năm 2015 – 2018 sử dụng các bài test RIASEC / Holland Code online và người dùng có thể truy cập và thực hiện bài test.</w:t>
+      </w:r>
+    </w:p>
+    <w:p>
+      <w:pPr>
+        <w:pStyle w:val="ListParagraph"/>
+        <w:numPr>
+          <w:ilvl w:val="0"/>
+          <w:numId w:val="7"/>
+        </w:numPr>
+        <w:spacing w:before="120" w:after="120" w:line="360" w:lineRule="auto"/>
+        <w:rPr>
+          <w:rFonts w:ascii="Times New Roman" w:hAnsi="Times New Roman" w:cs="Times New Roman"/>
+          <w:sz w:val="26"/>
+          <w:szCs w:val="26"/>
+        </w:rPr>
+      </w:pPr>
+      <w:r>
+        <w:rPr>
+          <w:rFonts w:ascii="Times New Roman" w:hAnsi="Times New Roman" w:cs="Times New Roman"/>
+          <w:sz w:val="26"/>
+          <w:szCs w:val="26"/>
+        </w:rPr>
+        <w:lastRenderedPageBreak/>
+        <w:t>Bên trong phiếu khảo sát có 48 câu dùng để tính thang đo của RIASEC, và 10 câu TIPI đánh giá tính cách cũng một số thông tin khác. Dataset này chứa tất cả những người đã tình nguyện hoàn thành cái khảo sát.</w:t>
+      </w:r>
+    </w:p>
+    <w:p>
+      <w:pPr>
+        <w:pStyle w:val="ListParagraph"/>
+        <w:numPr>
+          <w:ilvl w:val="0"/>
+          <w:numId w:val="7"/>
+        </w:numPr>
+        <w:spacing w:before="120" w:after="120" w:line="360" w:lineRule="auto"/>
+        <w:rPr>
+          <w:rFonts w:ascii="Times New Roman" w:hAnsi="Times New Roman" w:cs="Times New Roman"/>
+          <w:sz w:val="26"/>
+          <w:szCs w:val="26"/>
+        </w:rPr>
+      </w:pPr>
+      <w:r>
+        <w:rPr>
+          <w:rFonts w:ascii="Times New Roman" w:hAnsi="Times New Roman" w:cs="Times New Roman"/>
+          <w:sz w:val="26"/>
+          <w:szCs w:val="26"/>
+        </w:rPr>
+        <w:t xml:space="preserve">Dataset bao gồm hơn </w:t>
+      </w:r>
+      <w:r>
+        <w:rPr>
+          <w:rFonts w:ascii="Times New Roman" w:hAnsi="Times New Roman" w:cs="Times New Roman"/>
+          <w:sz w:val="26"/>
+          <w:szCs w:val="26"/>
+        </w:rPr>
+        <w:t>145829</w:t>
+      </w:r>
+      <w:r>
+        <w:rPr>
+          <w:rFonts w:ascii="Times New Roman" w:hAnsi="Times New Roman" w:cs="Times New Roman"/>
+          <w:sz w:val="26"/>
+          <w:szCs w:val="26"/>
+        </w:rPr>
+        <w:t xml:space="preserve"> </w:t>
+      </w:r>
+      <w:r>
+        <w:rPr>
+          <w:rFonts w:ascii="Times New Roman" w:hAnsi="Times New Roman" w:cs="Times New Roman"/>
+          <w:sz w:val="26"/>
+          <w:szCs w:val="26"/>
+        </w:rPr>
+        <w:t>bản ghi</w:t>
+      </w:r>
+      <w:r>
+        <w:rPr>
+          <w:rFonts w:ascii="Times New Roman" w:hAnsi="Times New Roman" w:cs="Times New Roman"/>
+          <w:sz w:val="26"/>
+          <w:szCs w:val="26"/>
+        </w:rPr>
+        <w:t xml:space="preserve"> được thu thập với nhiều ngành nghề khác nhau, từ đó chúng em thực hiện bước tiếp theo là bước tiền xử lý dữ liệu</w:t>
+      </w:r>
+    </w:p>
+    <w:p>
+      <w:pPr>
+        <w:spacing w:before="120" w:after="120" w:line="360" w:lineRule="auto"/>
+        <w:rPr>
+          <w:rFonts w:ascii="Times New Roman" w:hAnsi="Times New Roman" w:cs="Times New Roman"/>
+          <w:sz w:val="26"/>
+          <w:szCs w:val="26"/>
+        </w:rPr>
+      </w:pPr>
+      <w:r>
+        <w:rPr>
+          <w:rFonts w:ascii="Times New Roman" w:hAnsi="Times New Roman" w:cs="Times New Roman"/>
+          <w:b/>
+          <w:bCs/>
+          <w:sz w:val="26"/>
+          <w:szCs w:val="26"/>
+        </w:rPr>
+        <w:t xml:space="preserve">2.2. </w:t>
+      </w:r>
+      <w:r>
+        <w:rPr>
+          <w:rFonts w:ascii="Times New Roman" w:hAnsi="Times New Roman" w:cs="Times New Roman"/>
+          <w:b/>
+          <w:bCs/>
+          <w:sz w:val="26"/>
+          <w:szCs w:val="26"/>
+        </w:rPr>
+        <w:t>Tiền xử lý dữ liệu:</w:t>
+      </w:r>
+    </w:p>
+    <w:p>
+      <w:pPr>
+        <w:pStyle w:val="ListParagraph"/>
+        <w:numPr>
+          <w:ilvl w:val="0"/>
+          <w:numId w:val="7"/>
+        </w:numPr>
+        <w:spacing w:before="120" w:after="120" w:line="360" w:lineRule="auto"/>
+        <w:rPr>
+          <w:rFonts w:ascii="Times New Roman" w:hAnsi="Times New Roman" w:cs="Times New Roman"/>
+          <w:sz w:val="26"/>
+          <w:szCs w:val="26"/>
+        </w:rPr>
+      </w:pPr>
+      <w:r>
+        <w:rPr>
+          <w:rFonts w:ascii="Times New Roman" w:hAnsi="Times New Roman" w:cs="Times New Roman"/>
+          <w:sz w:val="26"/>
+          <w:szCs w:val="26"/>
+        </w:rPr>
+        <w:t>Khi bắt đầu tiền xử lý dữ liệu chúng em thấy có rất nhiều trường không phù hợp cho mô hình trong quá trình huấn luyện nên chúng em đã chọn ra những đặc trưng quan trọng nhất bao gồm 48 câu RIASEC, 10 câu TIPI, urban, gender.</w:t>
+      </w:r>
+    </w:p>
+    <w:p>
+      <w:pPr>
+        <w:pStyle w:val="ListParagraph"/>
+        <w:spacing w:before="120" w:after="120" w:line="360" w:lineRule="auto"/>
+        <w:rPr>
+          <w:rFonts w:ascii="Times New Roman" w:hAnsi="Times New Roman" w:cs="Times New Roman"/>
+          <w:sz w:val="26"/>
+          <w:szCs w:val="26"/>
+        </w:rPr>
+      </w:pPr>
+      <w:r>
+        <w:rPr>
+          <w:rFonts w:ascii="Times New Roman" w:hAnsi="Times New Roman" w:cs="Times New Roman"/>
+          <w:sz w:val="26"/>
+          <w:szCs w:val="26"/>
+        </w:rPr>
+        <w:drawing>
+          <wp:inline distT="0" distB="0" distL="0" distR="0" wp14:anchorId="7BBCF2B3" wp14:editId="766A252E">
+            <wp:extent cx="5943600" cy="2890520"/>
+            <wp:effectExtent l="0" t="0" r="0" b="5080"/>
+            <wp:docPr id="645807936" name="Picture 1"/>
+            <wp:cNvGraphicFramePr>
+              <a:graphicFrameLocks xmlns:a="http://schemas.openxmlformats.org/drawingml/2006/main" noChangeAspect="1"/>
+            </wp:cNvGraphicFramePr>
+            <a:graphic xmlns:a="http://schemas.openxmlformats.org/drawingml/2006/main">
+              <a:graphicData uri="http://schemas.openxmlformats.org/drawingml/2006/picture">
+                <pic:pic xmlns:pic="http://schemas.openxmlformats.org/drawingml/2006/picture">
+                  <pic:nvPicPr>
+                    <pic:cNvPr id="645807936" name=""/>
+                    <pic:cNvPicPr/>
+                  </pic:nvPicPr>
+                  <pic:blipFill>
+                    <a:blip r:embed="rId6"/>
+                    <a:stretch>
+                      <a:fillRect/>
+                    </a:stretch>
+                  </pic:blipFill>
+                  <pic:spPr>
+                    <a:xfrm>
+                      <a:off x="0" y="0"/>
+                      <a:ext cx="5943600" cy="2890520"/>
+                    </a:xfrm>
+                    <a:prstGeom prst="rect">
+                      <a:avLst/>
+                    </a:prstGeom>
+                  </pic:spPr>
+                </pic:pic>
+              </a:graphicData>
+            </a:graphic>
+          </wp:inline>
+        </w:drawing>
+      </w:r>
+    </w:p>
+    <w:p>
+      <w:pPr>
+        <w:pStyle w:val="ListParagraph"/>
+        <w:numPr>
+          <w:ilvl w:val="0"/>
+          <w:numId w:val="7"/>
+        </w:numPr>
+        <w:spacing w:before="120" w:after="120" w:line="360" w:lineRule="auto"/>
+        <w:rPr>
+          <w:rFonts w:ascii="Times New Roman" w:hAnsi="Times New Roman" w:cs="Times New Roman"/>
+          <w:sz w:val="26"/>
+          <w:szCs w:val="26"/>
+        </w:rPr>
+      </w:pPr>
+      <w:r>
+        <w:rPr>
+          <w:rFonts w:ascii="Times New Roman" w:hAnsi="Times New Roman" w:cs="Times New Roman"/>
+          <w:sz w:val="26"/>
+          <w:szCs w:val="26"/>
+        </w:rPr>
+        <w:t>Dữ liệu bên trong dataset toàn bộ đã được chuyển sang dạng số với câu hỏi RIASEC là từ 1 – 5 là mức độ đồng ý với câu hỏi và với câu TIPI là 1 – 7 ,gender và urban cũng đã được chuyển sang dạng số tương ứng.</w:t>
+      </w:r>
+    </w:p>
+    <w:p>
+      <w:pPr>
+        <w:pStyle w:val="ListParagraph"/>
+        <w:numPr>
+          <w:ilvl w:val="0"/>
+          <w:numId w:val="7"/>
+        </w:numPr>
+        <w:spacing w:before="120" w:after="120" w:line="360" w:lineRule="auto"/>
+        <w:rPr>
+          <w:rFonts w:ascii="Times New Roman" w:hAnsi="Times New Roman" w:cs="Times New Roman"/>
+          <w:sz w:val="26"/>
+          <w:szCs w:val="26"/>
+        </w:rPr>
+      </w:pPr>
+      <w:r>
+        <w:rPr>
+          <w:rFonts w:ascii="Times New Roman" w:hAnsi="Times New Roman" w:cs="Times New Roman"/>
+          <w:sz w:val="26"/>
+          <w:szCs w:val="26"/>
+        </w:rPr>
+        <w:t>Tiến hành lọc ngành, đầu tiên là sẽ chuyển đổi tất cả các ngành về chữ thường, sau đó lọc đi những ngành ít hơn 5 giúp giảm thiếu mất cân bằng dữ liệu.</w:t>
+      </w:r>
+    </w:p>
+    <w:p>
+      <w:pPr>
+        <w:pStyle w:val="ListParagraph"/>
+        <w:spacing w:before="120" w:after="120" w:line="360" w:lineRule="auto"/>
+        <w:rPr>
+          <w:rFonts w:ascii="Times New Roman" w:hAnsi="Times New Roman" w:cs="Times New Roman"/>
+          <w:sz w:val="26"/>
+          <w:szCs w:val="26"/>
+        </w:rPr>
+      </w:pPr>
+      <w:r>
+        <w:rPr>
+          <w:rFonts w:ascii="Times New Roman" w:hAnsi="Times New Roman" w:cs="Times New Roman"/>
+          <w:sz w:val="26"/>
+          <w:szCs w:val="26"/>
+        </w:rPr>
+        <w:lastRenderedPageBreak/>
+        <w:drawing>
+          <wp:inline distT="0" distB="0" distL="0" distR="0" wp14:anchorId="10739C7A" wp14:editId="3E469D4E">
+            <wp:extent cx="4724809" cy="3406435"/>
+            <wp:effectExtent l="0" t="0" r="0" b="3810"/>
+            <wp:docPr id="1812627264" name="Picture 1"/>
+            <wp:cNvGraphicFramePr>
+              <a:graphicFrameLocks xmlns:a="http://schemas.openxmlformats.org/drawingml/2006/main" noChangeAspect="1"/>
+            </wp:cNvGraphicFramePr>
+            <a:graphic xmlns:a="http://schemas.openxmlformats.org/drawingml/2006/main">
+              <a:graphicData uri="http://schemas.openxmlformats.org/drawingml/2006/picture">
+                <pic:pic xmlns:pic="http://schemas.openxmlformats.org/drawingml/2006/picture">
+                  <pic:nvPicPr>
+                    <pic:cNvPr id="1812627264" name=""/>
+                    <pic:cNvPicPr/>
+                  </pic:nvPicPr>
+                  <pic:blipFill>
+                    <a:blip r:embed="rId7"/>
+                    <a:stretch>
+                      <a:fillRect/>
+                    </a:stretch>
+                  </pic:blipFill>
+                  <pic:spPr>
+                    <a:xfrm>
+                      <a:off x="0" y="0"/>
+                      <a:ext cx="4724809" cy="3406435"/>
+                    </a:xfrm>
+                    <a:prstGeom prst="rect">
+                      <a:avLst/>
+                    </a:prstGeom>
+                  </pic:spPr>
+                </pic:pic>
+              </a:graphicData>
+            </a:graphic>
+          </wp:inline>
+        </w:drawing>
+      </w:r>
+    </w:p>
+    <w:p>
+      <w:pPr>
+        <w:pStyle w:val="ListParagraph"/>
+        <w:numPr>
+          <w:ilvl w:val="0"/>
+          <w:numId w:val="7"/>
+        </w:numPr>
+        <w:spacing w:before="120" w:after="120" w:line="360" w:lineRule="auto"/>
+        <w:rPr>
+          <w:rFonts w:ascii="Times New Roman" w:hAnsi="Times New Roman" w:cs="Times New Roman"/>
+          <w:sz w:val="26"/>
+          <w:szCs w:val="26"/>
+        </w:rPr>
+      </w:pPr>
+      <w:r>
+        <w:rPr>
+          <w:rFonts w:ascii="Times New Roman" w:hAnsi="Times New Roman" w:cs="Times New Roman"/>
+          <w:sz w:val="26"/>
+          <w:szCs w:val="26"/>
+        </w:rPr>
+        <w:t>Tiếp theo là lọc những giá trị không phải là ngành</w:t>
+      </w:r>
+    </w:p>
+    <w:p>
+      <w:pPr>
+        <w:pStyle w:val="ListParagraph"/>
+        <w:spacing w:before="120" w:after="120" w:line="360" w:lineRule="auto"/>
+        <w:rPr>
+          <w:rFonts w:ascii="Times New Roman" w:hAnsi="Times New Roman" w:cs="Times New Roman"/>
+          <w:sz w:val="26"/>
+          <w:szCs w:val="26"/>
+        </w:rPr>
+      </w:pPr>
+      <w:r>
+        <w:rPr>
+          <w:rFonts w:ascii="Times New Roman" w:hAnsi="Times New Roman" w:cs="Times New Roman"/>
+          <w:sz w:val="26"/>
+          <w:szCs w:val="26"/>
+        </w:rPr>
+        <w:drawing>
+          <wp:inline distT="0" distB="0" distL="0" distR="0" wp14:anchorId="4CB9C4F5" wp14:editId="6AF3A201">
+            <wp:extent cx="5943600" cy="755015"/>
+            <wp:effectExtent l="0" t="0" r="0" b="6985"/>
+            <wp:docPr id="1867012354" name="Picture 1"/>
+            <wp:cNvGraphicFramePr>
+              <a:graphicFrameLocks xmlns:a="http://schemas.openxmlformats.org/drawingml/2006/main" noChangeAspect="1"/>
+            </wp:cNvGraphicFramePr>
+            <a:graphic xmlns:a="http://schemas.openxmlformats.org/drawingml/2006/main">
+              <a:graphicData uri="http://schemas.openxmlformats.org/drawingml/2006/picture">
+                <pic:pic xmlns:pic="http://schemas.openxmlformats.org/drawingml/2006/picture">
+                  <pic:nvPicPr>
+                    <pic:cNvPr id="1867012354" name=""/>
+                    <pic:cNvPicPr/>
+                  </pic:nvPicPr>
+                  <pic:blipFill>
+                    <a:blip r:embed="rId8"/>
+                    <a:stretch>
+                      <a:fillRect/>
+                    </a:stretch>
+                  </pic:blipFill>
+                  <pic:spPr>
+                    <a:xfrm>
+                      <a:off x="0" y="0"/>
+                      <a:ext cx="5943600" cy="755015"/>
+                    </a:xfrm>
+                    <a:prstGeom prst="rect">
+                      <a:avLst/>
+                    </a:prstGeom>
+                  </pic:spPr>
+                </pic:pic>
+              </a:graphicData>
+            </a:graphic>
+          </wp:inline>
+        </w:drawing>
+      </w:r>
+    </w:p>
+    <w:p>
+      <w:pPr>
+        <w:pStyle w:val="ListParagraph"/>
+        <w:numPr>
+          <w:ilvl w:val="0"/>
+          <w:numId w:val="7"/>
+        </w:numPr>
+        <w:spacing w:before="120" w:after="120" w:line="360" w:lineRule="auto"/>
+        <w:rPr>
+          <w:rFonts w:ascii="Times New Roman" w:hAnsi="Times New Roman" w:cs="Times New Roman"/>
+          <w:sz w:val="26"/>
+          <w:szCs w:val="26"/>
+        </w:rPr>
+      </w:pPr>
+      <w:r>
+        <w:rPr>
+          <w:rFonts w:ascii="Times New Roman" w:hAnsi="Times New Roman" w:cs="Times New Roman"/>
+          <w:sz w:val="26"/>
+          <w:szCs w:val="26"/>
+        </w:rPr>
+        <w:t>Không bỏ qua các ngành nghề được viết tắt nên sẽ có bước chuẩn hóa các từ viết tắt lại thành một tên ngành cụ thể</w:t>
+      </w:r>
+    </w:p>
+    <w:p>
+      <w:pPr>
+        <w:pStyle w:val="ListParagraph"/>
+        <w:spacing w:before="120" w:after="120" w:line="360" w:lineRule="auto"/>
+        <w:rPr>
+          <w:rFonts w:ascii="Times New Roman" w:hAnsi="Times New Roman" w:cs="Times New Roman"/>
+          <w:sz w:val="26"/>
+          <w:szCs w:val="26"/>
+        </w:rPr>
+      </w:pPr>
+      <w:r>
+        <w:rPr>
+          <w:rFonts w:ascii="Times New Roman" w:hAnsi="Times New Roman" w:cs="Times New Roman"/>
+          <w:sz w:val="26"/>
+          <w:szCs w:val="26"/>
+        </w:rPr>
+        <w:lastRenderedPageBreak/>
+        <w:drawing>
+          <wp:inline distT="0" distB="0" distL="0" distR="0" wp14:anchorId="47BB1772" wp14:editId="789EBC76">
+            <wp:extent cx="5943600" cy="4605020"/>
+            <wp:effectExtent l="0" t="0" r="0" b="5080"/>
+            <wp:docPr id="424114666" name="Picture 1"/>
+            <wp:cNvGraphicFramePr>
+              <a:graphicFrameLocks xmlns:a="http://schemas.openxmlformats.org/drawingml/2006/main" noChangeAspect="1"/>
+            </wp:cNvGraphicFramePr>
+            <a:graphic xmlns:a="http://schemas.openxmlformats.org/drawingml/2006/main">
+              <a:graphicData uri="http://schemas.openxmlformats.org/drawingml/2006/picture">
+                <pic:pic xmlns:pic="http://schemas.openxmlformats.org/drawingml/2006/picture">
+                  <pic:nvPicPr>
+                    <pic:cNvPr id="424114666" name=""/>
+                    <pic:cNvPicPr/>
+                  </pic:nvPicPr>
+                  <pic:blipFill>
+                    <a:blip r:embed="rId9"/>
+                    <a:stretch>
+                      <a:fillRect/>
+                    </a:stretch>
+                  </pic:blipFill>
+                  <pic:spPr>
+                    <a:xfrm>
+                      <a:off x="0" y="0"/>
+                      <a:ext cx="5943600" cy="4605020"/>
+                    </a:xfrm>
+                    <a:prstGeom prst="rect">
+                      <a:avLst/>
+                    </a:prstGeom>
+                  </pic:spPr>
+                </pic:pic>
+              </a:graphicData>
+            </a:graphic>
+          </wp:inline>
+        </w:drawing>
+      </w:r>
+    </w:p>
+    <w:p>
+      <w:pPr>
+        <w:pStyle w:val="ListParagraph"/>
+        <w:numPr>
+          <w:ilvl w:val="0"/>
+          <w:numId w:val="7"/>
+        </w:numPr>
+        <w:spacing w:before="120" w:after="120" w:line="360" w:lineRule="auto"/>
+        <w:rPr>
+          <w:rFonts w:ascii="Times New Roman" w:hAnsi="Times New Roman" w:cs="Times New Roman"/>
+          <w:sz w:val="26"/>
+          <w:szCs w:val="26"/>
+        </w:rPr>
+      </w:pPr>
+      <w:r>
+        <w:rPr>
+          <w:rFonts w:ascii="Times New Roman" w:hAnsi="Times New Roman" w:cs="Times New Roman"/>
+          <w:sz w:val="26"/>
+          <w:szCs w:val="26"/>
+        </w:rPr>
+        <w:t>Cuối cùng các ngành sẽ được dịch thủ công với sự hỗ trợ của Chat GPT để chuyển các ngành nghề trên về Tiếng Việt</w:t>
+      </w:r>
+    </w:p>
+    <w:p>
+      <w:pPr>
+        <w:pStyle w:val="ListParagraph"/>
+        <w:spacing w:before="120" w:after="120" w:line="360" w:lineRule="auto"/>
+        <w:rPr>
+          <w:rFonts w:ascii="Times New Roman" w:hAnsi="Times New Roman" w:cs="Times New Roman"/>
+          <w:sz w:val="26"/>
+          <w:szCs w:val="26"/>
+        </w:rPr>
+      </w:pPr>
+      <w:r>
+        <w:rPr>
+          <w:rFonts w:ascii="Times New Roman" w:hAnsi="Times New Roman" w:cs="Times New Roman"/>
+          <w:sz w:val="26"/>
+          <w:szCs w:val="26"/>
+        </w:rPr>
+        <w:lastRenderedPageBreak/>
+        <w:drawing>
+          <wp:inline distT="0" distB="0" distL="0" distR="0" wp14:anchorId="27CD6BA5" wp14:editId="0EA76CF0">
+            <wp:extent cx="3269263" cy="3665538"/>
+            <wp:effectExtent l="0" t="0" r="7620" b="0"/>
+            <wp:docPr id="1105030422" name="Picture 1"/>
+            <wp:cNvGraphicFramePr>
+              <a:graphicFrameLocks xmlns:a="http://schemas.openxmlformats.org/drawingml/2006/main" noChangeAspect="1"/>
+            </wp:cNvGraphicFramePr>
+            <a:graphic xmlns:a="http://schemas.openxmlformats.org/drawingml/2006/main">
+              <a:graphicData uri="http://schemas.openxmlformats.org/drawingml/2006/picture">
+                <pic:pic xmlns:pic="http://schemas.openxmlformats.org/drawingml/2006/picture">
+                  <pic:nvPicPr>
+                    <pic:cNvPr id="1105030422" name=""/>
+                    <pic:cNvPicPr/>
+                  </pic:nvPicPr>
+                  <pic:blipFill>
+                    <a:blip r:embed="rId10"/>
+                    <a:stretch>
+                      <a:fillRect/>
+                    </a:stretch>
+                  </pic:blipFill>
+                  <pic:spPr>
+                    <a:xfrm>
+                      <a:off x="0" y="0"/>
+                      <a:ext cx="3269263" cy="3665538"/>
+                    </a:xfrm>
+                    <a:prstGeom prst="rect">
+                      <a:avLst/>
+                    </a:prstGeom>
+                  </pic:spPr>
+                </pic:pic>
+              </a:graphicData>
+            </a:graphic>
+          </wp:inline>
+        </w:drawing>
+      </w:r>
+    </w:p>
+    <w:p>
+      <w:pPr>
+        <w:pStyle w:val="ListParagraph"/>
+        <w:numPr>
+          <w:ilvl w:val="0"/>
+          <w:numId w:val="7"/>
+        </w:numPr>
+        <w:spacing w:before="120" w:after="120" w:line="360" w:lineRule="auto"/>
+        <w:rPr>
+          <w:rFonts w:ascii="Times New Roman" w:hAnsi="Times New Roman" w:cs="Times New Roman"/>
+          <w:sz w:val="26"/>
+          <w:szCs w:val="26"/>
+        </w:rPr>
+      </w:pPr>
+      <w:r>
+        <w:rPr>
+          <w:rFonts w:ascii="Times New Roman" w:hAnsi="Times New Roman" w:cs="Times New Roman"/>
+          <w:sz w:val="26"/>
+          <w:szCs w:val="26"/>
+        </w:rPr>
+        <w:t>Bởi vì số lượng ngành còn quá nhiều và có các ngành không quá phổ biến nên chúng em tiến hành gộp lại lại lĩnh vực</w:t>
+      </w:r>
+    </w:p>
+    <w:p>
+      <w:pPr>
+        <w:pStyle w:val="ListParagraph"/>
+        <w:spacing w:before="120" w:after="120" w:line="360" w:lineRule="auto"/>
+        <w:rPr>
+          <w:rFonts w:ascii="Times New Roman" w:hAnsi="Times New Roman" w:cs="Times New Roman"/>
+          <w:sz w:val="26"/>
+          <w:szCs w:val="26"/>
+        </w:rPr>
+      </w:pPr>
+      <w:r>
+        <w:rPr>
+          <w:rFonts w:ascii="Times New Roman" w:hAnsi="Times New Roman" w:cs="Times New Roman"/>
+          <w:sz w:val="26"/>
+          <w:szCs w:val="26"/>
+        </w:rPr>
+        <w:lastRenderedPageBreak/>
+        <w:drawing>
+          <wp:inline distT="0" distB="0" distL="0" distR="0" wp14:anchorId="41B8C3E0" wp14:editId="683F4369">
+            <wp:extent cx="3421677" cy="4237087"/>
+            <wp:effectExtent l="0" t="0" r="7620" b="0"/>
+            <wp:docPr id="1482182646" name="Picture 1"/>
+            <wp:cNvGraphicFramePr>
+              <a:graphicFrameLocks xmlns:a="http://schemas.openxmlformats.org/drawingml/2006/main" noChangeAspect="1"/>
+            </wp:cNvGraphicFramePr>
+            <a:graphic xmlns:a="http://schemas.openxmlformats.org/drawingml/2006/main">
+              <a:graphicData uri="http://schemas.openxmlformats.org/drawingml/2006/picture">
+                <pic:pic xmlns:pic="http://schemas.openxmlformats.org/drawingml/2006/picture">
+                  <pic:nvPicPr>
+                    <pic:cNvPr id="1482182646" name=""/>
+                    <pic:cNvPicPr/>
+                  </pic:nvPicPr>
+                  <pic:blipFill>
+                    <a:blip r:embed="rId11"/>
+                    <a:stretch>
+                      <a:fillRect/>
+                    </a:stretch>
+                  </pic:blipFill>
+                  <pic:spPr>
+                    <a:xfrm>
+                      <a:off x="0" y="0"/>
+                      <a:ext cx="3421677" cy="4237087"/>
+                    </a:xfrm>
+                    <a:prstGeom prst="rect">
+                      <a:avLst/>
+                    </a:prstGeom>
+                  </pic:spPr>
+                </pic:pic>
+              </a:graphicData>
+            </a:graphic>
+          </wp:inline>
+        </w:drawing>
+      </w:r>
+    </w:p>
+    <w:p>
+      <w:pPr>
+        <w:pStyle w:val="ListParagraph"/>
+        <w:numPr>
+          <w:ilvl w:val="0"/>
+          <w:numId w:val="7"/>
+        </w:numPr>
+        <w:spacing w:before="120" w:after="120" w:line="360" w:lineRule="auto"/>
+        <w:rPr>
+          <w:rFonts w:ascii="Times New Roman" w:hAnsi="Times New Roman" w:cs="Times New Roman"/>
+          <w:sz w:val="26"/>
+          <w:szCs w:val="26"/>
+        </w:rPr>
+      </w:pPr>
+      <w:r>
+        <w:rPr>
+          <w:rFonts w:ascii="Times New Roman" w:hAnsi="Times New Roman" w:cs="Times New Roman"/>
+          <w:sz w:val="26"/>
+          <w:szCs w:val="26"/>
+        </w:rPr>
+        <w:t xml:space="preserve">Kết quả cuối cùng thu được chỉ còn 73 ngành nghề với </w:t>
+      </w:r>
+      <w:r>
+        <w:rPr>
+          <w:rFonts w:ascii="Times New Roman" w:hAnsi="Times New Roman" w:cs="Times New Roman"/>
+          <w:sz w:val="26"/>
+          <w:szCs w:val="26"/>
+        </w:rPr>
+        <w:t>73260</w:t>
+      </w:r>
+      <w:r>
+        <w:rPr>
+          <w:rFonts w:ascii="Times New Roman" w:hAnsi="Times New Roman" w:cs="Times New Roman"/>
+          <w:sz w:val="26"/>
+          <w:szCs w:val="26"/>
+        </w:rPr>
+        <w:t xml:space="preserve"> dòng dữ liệu</w:t>
+      </w:r>
+      <w:r>
+        <w:rPr>
+          <w:rFonts w:ascii="Times New Roman" w:hAnsi="Times New Roman" w:cs="Times New Roman"/>
+          <w:sz w:val="26"/>
+          <w:szCs w:val="26"/>
+        </w:rPr>
+        <w:t xml:space="preserve"> sau khi lọc các ngành bị trống, không phải nghành và ngành hiếm, ít phổ biến.</w:t>
+      </w:r>
+    </w:p>
+    <w:p>
+      <w:pPr>
+        <w:spacing w:before="120" w:after="120" w:line="360" w:lineRule="auto"/>
+        <w:rPr>
+          <w:rFonts w:ascii="Times New Roman" w:hAnsi="Times New Roman" w:cs="Times New Roman"/>
+          <w:sz w:val="26"/>
+          <w:szCs w:val="26"/>
+        </w:rPr>
+      </w:pPr>
+      <w:r>
+        <w:rPr>
+          <w:rFonts w:ascii="Times New Roman" w:hAnsi="Times New Roman" w:cs="Times New Roman"/>
+          <w:b/>
+          <w:bCs/>
+          <w:sz w:val="26"/>
+          <w:szCs w:val="26"/>
+        </w:rPr>
+        <w:t>2.</w:t>
+      </w:r>
+      <w:r>
+        <w:rPr>
+          <w:rFonts w:ascii="Times New Roman" w:hAnsi="Times New Roman" w:cs="Times New Roman"/>
+          <w:b/>
+          <w:bCs/>
+          <w:sz w:val="26"/>
+          <w:szCs w:val="26"/>
+        </w:rPr>
+        <w:t>3</w:t>
+      </w:r>
+      <w:r>
+        <w:rPr>
+          <w:rFonts w:ascii="Times New Roman" w:hAnsi="Times New Roman" w:cs="Times New Roman"/>
+          <w:b/>
+          <w:bCs/>
+          <w:sz w:val="26"/>
+          <w:szCs w:val="26"/>
+        </w:rPr>
+        <w:t>. Kỹ thuật đặc trưng (Feature Engineering):</w:t>
       </w:r>
     </w:p>
     <w:p>
@@ -200,13 +1047,20 @@
           <w:ilvl w:val="0"/>
           <w:numId w:val="2"/>
         </w:numPr>
-      </w:pPr>
-      <w:r>
-        <w:rPr>
-          <w:b/>
-          <w:bCs/>
-        </w:rPr>
-        <w:t>2.1. Mô tả dữ liệu:</w:t>
+        <w:spacing w:before="120" w:after="120" w:line="360" w:lineRule="auto"/>
+        <w:rPr>
+          <w:rFonts w:ascii="Times New Roman" w:hAnsi="Times New Roman" w:cs="Times New Roman"/>
+          <w:sz w:val="26"/>
+          <w:szCs w:val="26"/>
+        </w:rPr>
+      </w:pPr>
+      <w:r>
+        <w:rPr>
+          <w:rFonts w:ascii="Times New Roman" w:hAnsi="Times New Roman" w:cs="Times New Roman"/>
+          <w:sz w:val="26"/>
+          <w:szCs w:val="26"/>
+        </w:rPr>
+        <w:t>Để tăng chất lượng tín hiệu và giảm nhiễu, các đặc trưng thô đã được xử lý thành các đặc trưng tổng hợp có ý nghĩa hơn:</w:t>
       </w:r>
     </w:p>
     <w:p>
@@ -215,19 +1069,38 @@
           <w:ilvl w:val="1"/>
           <w:numId w:val="2"/>
         </w:numPr>
-      </w:pPr>
-      <w:r>
-        <w:t>Bộ dữ liệu bao gồm kết quả trắc nghiệm của </w:t>
-      </w:r>
-      <w:r>
-        <w:rPr>
+        <w:spacing w:before="120" w:after="120" w:line="360" w:lineRule="auto"/>
+        <w:rPr>
+          <w:rFonts w:ascii="Times New Roman" w:hAnsi="Times New Roman" w:cs="Times New Roman"/>
+          <w:sz w:val="26"/>
+          <w:szCs w:val="26"/>
+        </w:rPr>
+      </w:pPr>
+      <w:r>
+        <w:rPr>
+          <w:rFonts w:ascii="Times New Roman" w:hAnsi="Times New Roman" w:cs="Times New Roman"/>
+          <w:sz w:val="26"/>
+          <w:szCs w:val="26"/>
+        </w:rPr>
+        <w:t>6 Đặc trưng trung bình RIASEC</w:t>
+      </w:r>
+      <w:r>
+        <w:rPr>
+          <w:rFonts w:ascii="Times New Roman" w:hAnsi="Times New Roman" w:cs="Times New Roman"/>
           <w:b/>
           <w:bCs/>
-        </w:rPr>
-        <w:t>[Số lượng người dùng, ví dụ: 73,260]</w:t>
-      </w:r>
-      <w:r>
-        <w:t> người dùng.</w:t>
+          <w:sz w:val="26"/>
+          <w:szCs w:val="26"/>
+        </w:rPr>
+        <w:t>:</w:t>
+      </w:r>
+      <w:r>
+        <w:rPr>
+          <w:rFonts w:ascii="Times New Roman" w:hAnsi="Times New Roman" w:cs="Times New Roman"/>
+          <w:sz w:val="26"/>
+          <w:szCs w:val="26"/>
+        </w:rPr>
+        <w:t> R_mean, I_mean,... được tính từ 8 câu hỏi của mỗi nhóm.</w:t>
       </w:r>
     </w:p>
     <w:p>
@@ -236,68 +1109,38 @@
           <w:ilvl w:val="1"/>
           <w:numId w:val="2"/>
         </w:numPr>
-      </w:pPr>
-      <w:r>
-        <w:rPr>
+        <w:spacing w:before="120" w:after="120" w:line="360" w:lineRule="auto"/>
+        <w:rPr>
+          <w:rFonts w:ascii="Times New Roman" w:hAnsi="Times New Roman" w:cs="Times New Roman"/>
+          <w:sz w:val="26"/>
+          <w:szCs w:val="26"/>
+        </w:rPr>
+      </w:pPr>
+      <w:r>
+        <w:rPr>
+          <w:rFonts w:ascii="Times New Roman" w:hAnsi="Times New Roman" w:cs="Times New Roman"/>
+          <w:sz w:val="26"/>
+          <w:szCs w:val="26"/>
+        </w:rPr>
+        <w:t>5 Đặc trưng Big Five</w:t>
+      </w:r>
+      <w:r>
+        <w:rPr>
+          <w:rFonts w:ascii="Times New Roman" w:hAnsi="Times New Roman" w:cs="Times New Roman"/>
           <w:b/>
           <w:bCs/>
-        </w:rPr>
-        <w:lastRenderedPageBreak/>
-        <w:t>Đặc trưng đầu vào (Features):</w:t>
-      </w:r>
-    </w:p>
-    <w:p>
-      <w:pPr>
-        <w:numPr>
-          <w:ilvl w:val="2"/>
-          <w:numId w:val="2"/>
-        </w:numPr>
-      </w:pPr>
-      <w:r>
-        <w:rPr>
-          <w:b/>
-          <w:bCs/>
-        </w:rPr>
-        <w:t>48 câu hỏi RIASEC:</w:t>
-      </w:r>
-      <w:r>
-        <w:t> Đo lường 6 nhóm sở thích nghề nghiệp: Realistic (R), Investigative (I), Artistic (A), Social (S), Enterprising (E), Conventional (C).</w:t>
-      </w:r>
-    </w:p>
-    <w:p>
-      <w:pPr>
-        <w:numPr>
-          <w:ilvl w:val="2"/>
-          <w:numId w:val="2"/>
-        </w:numPr>
-      </w:pPr>
-      <w:r>
-        <w:rPr>
-          <w:b/>
-          <w:bCs/>
-        </w:rPr>
-        <w:t>10 câu hỏi TIPI:</w:t>
-      </w:r>
-      <w:r>
-        <w:t> Đo lường 5 khía cạnh tính cách lớn (Big Five).</w:t>
-      </w:r>
-    </w:p>
-    <w:p>
-      <w:pPr>
-        <w:numPr>
-          <w:ilvl w:val="2"/>
-          <w:numId w:val="2"/>
-        </w:numPr>
-      </w:pPr>
-      <w:r>
-        <w:rPr>
-          <w:b/>
-          <w:bCs/>
-        </w:rPr>
-        <w:t>Thông tin nhân khẩu học:</w:t>
-      </w:r>
-      <w:r>
-        <w:t> gender (giới tính) và urban (khu vực sinh sống).</w:t>
+          <w:sz w:val="26"/>
+          <w:szCs w:val="26"/>
+        </w:rPr>
+        <w:t>:</w:t>
+      </w:r>
+      <w:r>
+        <w:rPr>
+          <w:rFonts w:ascii="Times New Roman" w:hAnsi="Times New Roman" w:cs="Times New Roman"/>
+          <w:sz w:val="26"/>
+          <w:szCs w:val="26"/>
+        </w:rPr>
+        <w:t> TIPI_Extraversion, TIPI_Agreeableness,... được tính từ 10 câu hỏi TIPI (có xử lý đảo ngược điểm cho các câu hỏi phù hợp).</w:t>
       </w:r>
     </w:p>
     <w:p>
@@ -306,31 +1149,28 @@
           <w:ilvl w:val="1"/>
           <w:numId w:val="2"/>
         </w:numPr>
-      </w:pPr>
-      <w:r>
-        <w:rPr>
-          <w:b/>
-          <w:bCs/>
-        </w:rPr>
-        <w:t>Nhãn mục tiêu (Labels):</w:t>
-      </w:r>
-      <w:r>
-        <w:t> 55 ngành học khác nhau, cho thấy sự phân bố mất cân bằng nghiêm trọng (ví dụ: Tâm lý học có ~16,000 mẫu trong khi nhiều ngành chỉ có dưới 50 mẫu).</w:t>
-      </w:r>
-    </w:p>
-    <w:p>
-      <w:pPr>
-        <w:numPr>
-          <w:ilvl w:val="0"/>
-          <w:numId w:val="2"/>
-        </w:numPr>
-      </w:pPr>
-      <w:r>
-        <w:rPr>
-          <w:b/>
-          <w:bCs/>
-        </w:rPr>
-        <w:t>2.2. Kỹ thuật đặc trưng (Feature Engineering):</w:t>
+        <w:spacing w:before="120" w:after="120" w:line="360" w:lineRule="auto"/>
+        <w:rPr>
+          <w:rFonts w:ascii="Times New Roman" w:hAnsi="Times New Roman" w:cs="Times New Roman"/>
+          <w:sz w:val="26"/>
+          <w:szCs w:val="26"/>
+        </w:rPr>
+      </w:pPr>
+      <w:r>
+        <w:rPr>
+          <w:rFonts w:ascii="Times New Roman" w:hAnsi="Times New Roman" w:cs="Times New Roman"/>
+          <w:sz w:val="26"/>
+          <w:szCs w:val="26"/>
+        </w:rPr>
+        <w:t>Đặc trưng "Hồ sơ Holland":</w:t>
+      </w:r>
+      <w:r>
+        <w:rPr>
+          <w:rFonts w:ascii="Times New Roman" w:hAnsi="Times New Roman" w:cs="Times New Roman"/>
+          <w:sz w:val="26"/>
+          <w:szCs w:val="26"/>
+        </w:rPr>
+        <w:t> Tạo ra các biến phân loại top_1_code, top_2_code, top_3_code để xác định 3 nhóm RIASEC có điểm cao nhất của mỗi người.</w:t>
       </w:r>
     </w:p>
     <w:p>
@@ -339,80 +1179,38 @@
           <w:ilvl w:val="1"/>
           <w:numId w:val="2"/>
         </w:numPr>
-      </w:pPr>
-      <w:r>
-        <w:t>Để tăng chất lượng tín hiệu và giảm nhiễu, các đặc trưng thô đã được xử lý thành các đặc trưng tổng hợp có ý nghĩa hơn:</w:t>
-      </w:r>
-    </w:p>
-    <w:p>
-      <w:pPr>
-        <w:numPr>
-          <w:ilvl w:val="2"/>
-          <w:numId w:val="2"/>
-        </w:numPr>
-      </w:pPr>
-      <w:r>
-        <w:rPr>
+        <w:spacing w:before="120" w:after="120" w:line="360" w:lineRule="auto"/>
+        <w:rPr>
+          <w:rFonts w:ascii="Times New Roman" w:hAnsi="Times New Roman" w:cs="Times New Roman"/>
+          <w:sz w:val="26"/>
+          <w:szCs w:val="26"/>
+        </w:rPr>
+      </w:pPr>
+      <w:r>
+        <w:rPr>
+          <w:rFonts w:ascii="Times New Roman" w:hAnsi="Times New Roman" w:cs="Times New Roman"/>
+          <w:sz w:val="26"/>
+          <w:szCs w:val="26"/>
+        </w:rPr>
+        <w:lastRenderedPageBreak/>
+        <w:t>Đặc trưng thống kê</w:t>
+      </w:r>
+      <w:r>
+        <w:rPr>
+          <w:rFonts w:ascii="Times New Roman" w:hAnsi="Times New Roman" w:cs="Times New Roman"/>
           <w:b/>
           <w:bCs/>
-        </w:rPr>
-        <w:t>6 Đặc trưng trung bình RIASEC:</w:t>
-      </w:r>
-      <w:r>
-        <w:t> R_mean, I_mean,... được tính từ 8 câu hỏi của mỗi nhóm.</w:t>
-      </w:r>
-    </w:p>
-    <w:p>
-      <w:pPr>
-        <w:numPr>
-          <w:ilvl w:val="2"/>
-          <w:numId w:val="2"/>
-        </w:numPr>
-      </w:pPr>
-      <w:r>
-        <w:rPr>
-          <w:b/>
-          <w:bCs/>
-        </w:rPr>
-        <w:t>5 Đặc trưng Big Five:</w:t>
-      </w:r>
-      <w:r>
-        <w:t> TIPI_Extraversion, TIPI_Agreeableness,... được tính từ 10 câu hỏi TIPI (có xử lý đảo ngược điểm cho các câu hỏi phù hợp).</w:t>
-      </w:r>
-    </w:p>
-    <w:p>
-      <w:pPr>
-        <w:numPr>
-          <w:ilvl w:val="2"/>
-          <w:numId w:val="2"/>
-        </w:numPr>
-      </w:pPr>
-      <w:r>
-        <w:rPr>
-          <w:b/>
-          <w:bCs/>
-        </w:rPr>
-        <w:t>Đặc trưng "Hồ sơ Holland":</w:t>
-      </w:r>
-      <w:r>
-        <w:t> Tạo ra các biến phân loại top_1_code, top_2_code, top_3_code để xác định 3 nhóm RIASEC có điểm cao nhất của mỗi người.</w:t>
-      </w:r>
-    </w:p>
-    <w:p>
-      <w:pPr>
-        <w:numPr>
-          <w:ilvl w:val="2"/>
-          <w:numId w:val="2"/>
-        </w:numPr>
-      </w:pPr>
-      <w:r>
-        <w:rPr>
-          <w:b/>
-          <w:bCs/>
-        </w:rPr>
-        <w:t>Đặc trưng thống kê:</w:t>
-      </w:r>
-      <w:r>
+          <w:sz w:val="26"/>
+          <w:szCs w:val="26"/>
+        </w:rPr>
+        <w:t>:</w:t>
+      </w:r>
+      <w:r>
+        <w:rPr>
+          <w:rFonts w:ascii="Times New Roman" w:hAnsi="Times New Roman" w:cs="Times New Roman"/>
+          <w:sz w:val="26"/>
+          <w:szCs w:val="26"/>
+        </w:rPr>
         <w:t> score_range (độ chênh lệch điểm) và score_std (độ lệch chuẩn) để đo lường mức độ rõ ràng của hồ sơ tính cách.</w:t>
       </w:r>
     </w:p>
@@ -422,31 +1220,542 @@
           <w:ilvl w:val="1"/>
           <w:numId w:val="2"/>
         </w:numPr>
-      </w:pPr>
-      <w:r>
+        <w:spacing w:before="120" w:after="120" w:line="360" w:lineRule="auto"/>
+        <w:rPr>
+          <w:rFonts w:ascii="Times New Roman" w:hAnsi="Times New Roman" w:cs="Times New Roman"/>
+          <w:sz w:val="26"/>
+          <w:szCs w:val="26"/>
+        </w:rPr>
+      </w:pPr>
+      <w:r>
+        <w:rPr>
+          <w:rFonts w:ascii="Times New Roman" w:hAnsi="Times New Roman" w:cs="Times New Roman"/>
+          <w:sz w:val="26"/>
+          <w:szCs w:val="26"/>
+        </w:rPr>
         <w:t>Các biến phân loại (gender, urban, top_x_code) được mã hóa bằng phương pháp One-Hot Encoding.</w:t>
       </w:r>
     </w:p>
     <w:p>
-      <w:r>
-        <w:pict w14:anchorId="6B08CC2C">
-          <v:rect id="_x0000_i1064" style="width:664.2pt;height:1.5pt" o:hrpct="0" o:hralign="center" o:hrstd="t" o:hr="t" fillcolor="#a0a0a0" stroked="f"/>
-        </w:pict>
-      </w:r>
-    </w:p>
-    <w:p>
-      <w:pPr>
-        <w:rPr>
+      <w:pPr>
+        <w:spacing w:before="120" w:after="120" w:line="360" w:lineRule="auto"/>
+        <w:rPr>
+          <w:rFonts w:ascii="Times New Roman" w:hAnsi="Times New Roman" w:cs="Times New Roman"/>
           <w:b/>
           <w:bCs/>
-        </w:rPr>
-      </w:pPr>
-      <w:r>
-        <w:rPr>
+          <w:sz w:val="26"/>
+          <w:szCs w:val="26"/>
+        </w:rPr>
+      </w:pPr>
+      <w:r>
+        <w:rPr>
+          <w:rFonts w:ascii="Times New Roman" w:hAnsi="Times New Roman" w:cs="Times New Roman"/>
           <w:b/>
           <w:bCs/>
+          <w:sz w:val="26"/>
+          <w:szCs w:val="26"/>
         </w:rPr>
         <w:t>3. PHƯƠNG PHÁP VÀ KIẾN TRÚC MÔ HÌNH</w:t>
+      </w:r>
+    </w:p>
+    <w:p>
+      <w:pPr>
+        <w:spacing w:before="120" w:after="120" w:line="360" w:lineRule="auto"/>
+        <w:rPr>
+          <w:rFonts w:ascii="Times New Roman" w:hAnsi="Times New Roman" w:cs="Times New Roman"/>
+          <w:sz w:val="26"/>
+          <w:szCs w:val="26"/>
+        </w:rPr>
+      </w:pPr>
+      <w:r>
+        <w:rPr>
+          <w:rFonts w:ascii="Times New Roman" w:hAnsi="Times New Roman" w:cs="Times New Roman"/>
+          <w:b/>
+          <w:bCs/>
+          <w:sz w:val="26"/>
+          <w:szCs w:val="26"/>
+        </w:rPr>
+        <w:t>3.1. Thách thức:</w:t>
+      </w:r>
+      <w:r>
+        <w:rPr>
+          <w:rFonts w:ascii="Times New Roman" w:hAnsi="Times New Roman" w:cs="Times New Roman"/>
+          <w:sz w:val="26"/>
+          <w:szCs w:val="26"/>
+        </w:rPr>
+        <w:t xml:space="preserve"> Bài toán phân loại trực tiếp </w:t>
+      </w:r>
+      <w:r>
+        <w:rPr>
+          <w:rFonts w:ascii="Times New Roman" w:hAnsi="Times New Roman" w:cs="Times New Roman"/>
+          <w:sz w:val="26"/>
+          <w:szCs w:val="26"/>
+        </w:rPr>
+        <w:t>73</w:t>
+      </w:r>
+      <w:r>
+        <w:rPr>
+          <w:rFonts w:ascii="Times New Roman" w:hAnsi="Times New Roman" w:cs="Times New Roman"/>
+          <w:sz w:val="26"/>
+          <w:szCs w:val="26"/>
+        </w:rPr>
+        <w:t xml:space="preserve"> ngành học gặp khó khăn do số lượng lớp lớn và mất cân bằng</w:t>
+      </w:r>
+      <w:r>
+        <w:rPr>
+          <w:rFonts w:ascii="Times New Roman" w:hAnsi="Times New Roman" w:cs="Times New Roman"/>
+          <w:sz w:val="26"/>
+          <w:szCs w:val="26"/>
+        </w:rPr>
+        <w:t xml:space="preserve"> trầm trọng</w:t>
+      </w:r>
+      <w:r>
+        <w:rPr>
+          <w:rFonts w:ascii="Times New Roman" w:hAnsi="Times New Roman" w:cs="Times New Roman"/>
+          <w:sz w:val="26"/>
+          <w:szCs w:val="26"/>
+        </w:rPr>
+        <w:t>, dẫn đến độ chính xác thấp và mô hình thiên vị.</w:t>
+      </w:r>
+    </w:p>
+    <w:p>
+      <w:pPr>
+        <w:spacing w:before="120" w:after="120" w:line="360" w:lineRule="auto"/>
+        <w:rPr>
+          <w:rFonts w:ascii="Times New Roman" w:hAnsi="Times New Roman" w:cs="Times New Roman"/>
+          <w:sz w:val="26"/>
+          <w:szCs w:val="26"/>
+        </w:rPr>
+      </w:pPr>
+      <w:r>
+        <w:rPr>
+          <w:rFonts w:ascii="Times New Roman" w:hAnsi="Times New Roman" w:cs="Times New Roman"/>
+          <w:b/>
+          <w:bCs/>
+          <w:sz w:val="26"/>
+          <w:szCs w:val="26"/>
+        </w:rPr>
+        <w:t xml:space="preserve">3.2. Giải pháp kiến trúc: </w:t>
+      </w:r>
+      <w:r>
+        <w:rPr>
+          <w:rFonts w:ascii="Times New Roman" w:hAnsi="Times New Roman" w:cs="Times New Roman"/>
+          <w:sz w:val="26"/>
+          <w:szCs w:val="26"/>
+        </w:rPr>
+        <w:t>Hệ thống Phân loại Phân tầng (Hierarchical Classification)</w:t>
+      </w:r>
+    </w:p>
+    <w:p>
+      <w:pPr>
+        <w:spacing w:before="120" w:after="120" w:line="360" w:lineRule="auto"/>
+        <w:rPr>
+          <w:rFonts w:ascii="Times New Roman" w:hAnsi="Times New Roman" w:cs="Times New Roman"/>
+          <w:sz w:val="26"/>
+          <w:szCs w:val="26"/>
+        </w:rPr>
+      </w:pPr>
+      <w:r>
+        <w:rPr>
+          <w:rFonts w:ascii="Times New Roman" w:hAnsi="Times New Roman" w:cs="Times New Roman"/>
+          <w:sz w:val="26"/>
+          <w:szCs w:val="26"/>
+        </w:rPr>
+        <w:t>- Chúng em chọn mô hình XGBoost vì các lý do như mô hình mạnh mẽ hơn so với các mô hình truyền thống như DecisionTree, RandomForest.</w:t>
+      </w:r>
+    </w:p>
+    <w:p>
+      <w:pPr>
+        <w:numPr>
+          <w:ilvl w:val="1"/>
+          <w:numId w:val="3"/>
+        </w:numPr>
+        <w:tabs>
+          <w:tab w:val="clear" w:pos="1440"/>
+          <w:tab w:val="num" w:pos="360"/>
+        </w:tabs>
+        <w:spacing w:before="120" w:after="120" w:line="360" w:lineRule="auto"/>
+        <w:ind w:left="360"/>
+        <w:rPr>
+          <w:rFonts w:ascii="Times New Roman" w:hAnsi="Times New Roman" w:cs="Times New Roman"/>
+          <w:sz w:val="26"/>
+          <w:szCs w:val="26"/>
+        </w:rPr>
+      </w:pPr>
+      <w:r>
+        <w:rPr>
+          <w:rFonts w:ascii="Times New Roman" w:hAnsi="Times New Roman" w:cs="Times New Roman"/>
+          <w:sz w:val="26"/>
+          <w:szCs w:val="26"/>
+        </w:rPr>
+        <w:t>Để giải quyết thách thức trên, một kiến trúc gồm 2 cấp mô hình đã được xây dựng:</w:t>
+      </w:r>
+    </w:p>
+    <w:p>
+      <w:pPr>
+        <w:numPr>
+          <w:ilvl w:val="2"/>
+          <w:numId w:val="3"/>
+        </w:numPr>
+        <w:tabs>
+          <w:tab w:val="clear" w:pos="2160"/>
+          <w:tab w:val="num" w:pos="1080"/>
+        </w:tabs>
+        <w:spacing w:before="120" w:after="120" w:line="360" w:lineRule="auto"/>
+        <w:ind w:left="1080"/>
+        <w:rPr>
+          <w:rFonts w:ascii="Times New Roman" w:hAnsi="Times New Roman" w:cs="Times New Roman"/>
+          <w:sz w:val="26"/>
+          <w:szCs w:val="26"/>
+        </w:rPr>
+      </w:pPr>
+      <w:r>
+        <w:rPr>
+          <w:rFonts w:ascii="Times New Roman" w:hAnsi="Times New Roman" w:cs="Times New Roman"/>
+          <w:b/>
+          <w:bCs/>
+          <w:sz w:val="26"/>
+          <w:szCs w:val="26"/>
+        </w:rPr>
+        <w:t>Mô hình Cấp 1 (Parent Model):</w:t>
+      </w:r>
+    </w:p>
+    <w:p>
+      <w:pPr>
+        <w:numPr>
+          <w:ilvl w:val="3"/>
+          <w:numId w:val="3"/>
+        </w:numPr>
+        <w:tabs>
+          <w:tab w:val="clear" w:pos="2880"/>
+          <w:tab w:val="num" w:pos="1800"/>
+        </w:tabs>
+        <w:spacing w:before="120" w:after="120" w:line="360" w:lineRule="auto"/>
+        <w:ind w:left="1800"/>
+        <w:rPr>
+          <w:rFonts w:ascii="Times New Roman" w:hAnsi="Times New Roman" w:cs="Times New Roman"/>
+          <w:sz w:val="26"/>
+          <w:szCs w:val="26"/>
+        </w:rPr>
+      </w:pPr>
+      <w:r>
+        <w:rPr>
+          <w:rFonts w:ascii="Times New Roman" w:hAnsi="Times New Roman" w:cs="Times New Roman"/>
+          <w:sz w:val="26"/>
+          <w:szCs w:val="26"/>
+        </w:rPr>
+        <w:t>Nhiệm vụ:</w:t>
+      </w:r>
+      <w:r>
+        <w:rPr>
+          <w:rFonts w:ascii="Times New Roman" w:hAnsi="Times New Roman" w:cs="Times New Roman"/>
+          <w:sz w:val="26"/>
+          <w:szCs w:val="26"/>
+        </w:rPr>
+        <w:t xml:space="preserve"> Phân loại dữ liệu đầu vào </w:t>
+      </w:r>
+      <w:r>
+        <w:rPr>
+          <w:rFonts w:ascii="Times New Roman" w:hAnsi="Times New Roman" w:cs="Times New Roman"/>
+          <w:sz w:val="26"/>
+          <w:szCs w:val="26"/>
+        </w:rPr>
+        <w:t>vào 6 "siêu nhóm" lĩnh vực</w:t>
+      </w:r>
+      <w:r>
+        <w:rPr>
+          <w:rFonts w:ascii="Times New Roman" w:hAnsi="Times New Roman" w:cs="Times New Roman"/>
+          <w:sz w:val="26"/>
+          <w:szCs w:val="26"/>
+        </w:rPr>
+        <w:t> (Xã hội - Giáo dục, Khoa học - Y tế, Kinh tế - Kỹ thuật, v.v.). Các nhóm này được tạo ra dựa trên phân tích ma trận nhầm lẫn để gom các lĩnh vực hay bị nhầm lẫn với nhau.</w:t>
+      </w:r>
+    </w:p>
+    <w:p>
+      <w:pPr>
+        <w:numPr>
+          <w:ilvl w:val="3"/>
+          <w:numId w:val="3"/>
+        </w:numPr>
+        <w:tabs>
+          <w:tab w:val="clear" w:pos="2880"/>
+          <w:tab w:val="num" w:pos="1800"/>
+        </w:tabs>
+        <w:spacing w:before="120" w:after="120" w:line="360" w:lineRule="auto"/>
+        <w:ind w:left="1800"/>
+        <w:rPr>
+          <w:rFonts w:ascii="Times New Roman" w:hAnsi="Times New Roman" w:cs="Times New Roman"/>
+          <w:sz w:val="26"/>
+          <w:szCs w:val="26"/>
+        </w:rPr>
+      </w:pPr>
+      <w:r>
+        <w:rPr>
+          <w:rFonts w:ascii="Times New Roman" w:hAnsi="Times New Roman" w:cs="Times New Roman"/>
+          <w:sz w:val="26"/>
+          <w:szCs w:val="26"/>
+        </w:rPr>
+        <w:t>Thuật toán:</w:t>
+      </w:r>
+      <w:r>
+        <w:rPr>
+          <w:rFonts w:ascii="Times New Roman" w:hAnsi="Times New Roman" w:cs="Times New Roman"/>
+          <w:sz w:val="26"/>
+          <w:szCs w:val="26"/>
+        </w:rPr>
+        <w:t> XGBoost, được tinh chỉnh bằng RandomizedSearchCV.</w:t>
+      </w:r>
+    </w:p>
+    <w:p>
+      <w:pPr>
+        <w:numPr>
+          <w:ilvl w:val="2"/>
+          <w:numId w:val="3"/>
+        </w:numPr>
+        <w:tabs>
+          <w:tab w:val="clear" w:pos="2160"/>
+          <w:tab w:val="num" w:pos="1080"/>
+        </w:tabs>
+        <w:spacing w:before="120" w:after="120" w:line="360" w:lineRule="auto"/>
+        <w:ind w:left="1080"/>
+        <w:rPr>
+          <w:rFonts w:ascii="Times New Roman" w:hAnsi="Times New Roman" w:cs="Times New Roman"/>
+          <w:sz w:val="26"/>
+          <w:szCs w:val="26"/>
+        </w:rPr>
+      </w:pPr>
+      <w:r>
+        <w:rPr>
+          <w:rFonts w:ascii="Times New Roman" w:hAnsi="Times New Roman" w:cs="Times New Roman"/>
+          <w:b/>
+          <w:bCs/>
+          <w:sz w:val="26"/>
+          <w:szCs w:val="26"/>
+        </w:rPr>
+        <w:t>Các Mô hình Cấp 2 (Child Models):</w:t>
+      </w:r>
+    </w:p>
+    <w:p>
+      <w:pPr>
+        <w:numPr>
+          <w:ilvl w:val="3"/>
+          <w:numId w:val="3"/>
+        </w:numPr>
+        <w:tabs>
+          <w:tab w:val="clear" w:pos="2880"/>
+          <w:tab w:val="num" w:pos="1800"/>
+        </w:tabs>
+        <w:spacing w:before="120" w:after="120" w:line="360" w:lineRule="auto"/>
+        <w:ind w:left="1800"/>
+        <w:rPr>
+          <w:rFonts w:ascii="Times New Roman" w:hAnsi="Times New Roman" w:cs="Times New Roman"/>
+          <w:sz w:val="26"/>
+          <w:szCs w:val="26"/>
+        </w:rPr>
+      </w:pPr>
+      <w:r>
+        <w:rPr>
+          <w:rFonts w:ascii="Times New Roman" w:hAnsi="Times New Roman" w:cs="Times New Roman"/>
+          <w:sz w:val="26"/>
+          <w:szCs w:val="26"/>
+        </w:rPr>
+        <w:t>Nhiệm vụ</w:t>
+      </w:r>
+      <w:r>
+        <w:rPr>
+          <w:rFonts w:ascii="Times New Roman" w:hAnsi="Times New Roman" w:cs="Times New Roman"/>
+          <w:b/>
+          <w:bCs/>
+          <w:sz w:val="26"/>
+          <w:szCs w:val="26"/>
+        </w:rPr>
+        <w:t>:</w:t>
+      </w:r>
+      <w:r>
+        <w:rPr>
+          <w:rFonts w:ascii="Times New Roman" w:hAnsi="Times New Roman" w:cs="Times New Roman"/>
+          <w:sz w:val="26"/>
+          <w:szCs w:val="26"/>
+        </w:rPr>
+        <w:t> Gồm nhiều mô hình XGBoost chuyên biệt. Mỗi mô hình chỉ được huấn luyện trên dữ liệu của một lĩnh vực và có nhiệm vụ phân biệt các ngành học </w:t>
+      </w:r>
+      <w:r>
+        <w:rPr>
+          <w:rFonts w:ascii="Times New Roman" w:hAnsi="Times New Roman" w:cs="Times New Roman"/>
+          <w:sz w:val="26"/>
+          <w:szCs w:val="26"/>
+        </w:rPr>
+        <w:t>bên trong </w:t>
+      </w:r>
+      <w:r>
+        <w:rPr>
+          <w:rFonts w:ascii="Times New Roman" w:hAnsi="Times New Roman" w:cs="Times New Roman"/>
+          <w:sz w:val="26"/>
+          <w:szCs w:val="26"/>
+        </w:rPr>
+        <w:t>lĩnh vực đó.</w:t>
+      </w:r>
+    </w:p>
+    <w:p>
+      <w:pPr>
+        <w:numPr>
+          <w:ilvl w:val="3"/>
+          <w:numId w:val="3"/>
+        </w:numPr>
+        <w:tabs>
+          <w:tab w:val="clear" w:pos="2880"/>
+          <w:tab w:val="num" w:pos="1800"/>
+        </w:tabs>
+        <w:spacing w:before="120" w:after="120" w:line="360" w:lineRule="auto"/>
+        <w:ind w:left="1800"/>
+        <w:rPr>
+          <w:rFonts w:ascii="Times New Roman" w:hAnsi="Times New Roman" w:cs="Times New Roman"/>
+          <w:sz w:val="26"/>
+          <w:szCs w:val="26"/>
+        </w:rPr>
+      </w:pPr>
+      <w:r>
+        <w:rPr>
+          <w:rFonts w:ascii="Times New Roman" w:hAnsi="Times New Roman" w:cs="Times New Roman"/>
+          <w:sz w:val="26"/>
+          <w:szCs w:val="26"/>
+        </w:rPr>
+        <w:t>Ví dụ</w:t>
+      </w:r>
+      <w:r>
+        <w:rPr>
+          <w:rFonts w:ascii="Times New Roman" w:hAnsi="Times New Roman" w:cs="Times New Roman"/>
+          <w:b/>
+          <w:bCs/>
+          <w:sz w:val="26"/>
+          <w:szCs w:val="26"/>
+        </w:rPr>
+        <w:t>:</w:t>
+      </w:r>
+      <w:r>
+        <w:rPr>
+          <w:rFonts w:ascii="Times New Roman" w:hAnsi="Times New Roman" w:cs="Times New Roman"/>
+          <w:sz w:val="26"/>
+          <w:szCs w:val="26"/>
+        </w:rPr>
+        <w:t> Mô hình "Kinh tế - Kỹ thuật" học cách phân biệt giữa 15 ngành như Kỹ thuật cơ khí, Quản trị kinh doanh, Luật...</w:t>
+      </w:r>
+    </w:p>
+    <w:p>
+      <w:pPr>
+        <w:spacing w:before="120" w:after="120" w:line="360" w:lineRule="auto"/>
+        <w:ind w:left="720"/>
+        <w:rPr>
+          <w:rFonts w:ascii="Times New Roman" w:hAnsi="Times New Roman" w:cs="Times New Roman"/>
+          <w:sz w:val="26"/>
+          <w:szCs w:val="26"/>
+        </w:rPr>
+      </w:pPr>
+      <w:r>
+        <w:rPr>
+          <w:rFonts w:ascii="Times New Roman" w:hAnsi="Times New Roman" w:cs="Times New Roman"/>
+          <w:sz w:val="26"/>
+          <w:szCs w:val="26"/>
+        </w:rPr>
+        <w:t>Tham số XGBoost (sau tinh chỉnh):</w:t>
+      </w:r>
+    </w:p>
+    <w:p>
+      <w:pPr>
+        <w:numPr>
+          <w:ilvl w:val="0"/>
+          <w:numId w:val="8"/>
+        </w:numPr>
+        <w:tabs>
+          <w:tab w:val="clear" w:pos="720"/>
+          <w:tab w:val="num" w:pos="1440"/>
+        </w:tabs>
+        <w:spacing w:before="120" w:after="120" w:line="360" w:lineRule="auto"/>
+        <w:ind w:left="1440"/>
+        <w:rPr>
+          <w:rFonts w:ascii="Times New Roman" w:hAnsi="Times New Roman" w:cs="Times New Roman"/>
+          <w:sz w:val="26"/>
+          <w:szCs w:val="26"/>
+        </w:rPr>
+      </w:pPr>
+      <w:r>
+        <w:rPr>
+          <w:rFonts w:ascii="Times New Roman" w:hAnsi="Times New Roman" w:cs="Times New Roman"/>
+          <w:sz w:val="26"/>
+          <w:szCs w:val="26"/>
+        </w:rPr>
+        <w:lastRenderedPageBreak/>
+        <w:t>Cấp 1: n_estimators=300, max_depth=6, learning_rate=0.05, subsample=0.9, colsample_bytree=0.8, gamma=0.5, reg_lambda=1.</w:t>
+      </w:r>
+    </w:p>
+    <w:p>
+      <w:pPr>
+        <w:numPr>
+          <w:ilvl w:val="0"/>
+          <w:numId w:val="8"/>
+        </w:numPr>
+        <w:tabs>
+          <w:tab w:val="clear" w:pos="720"/>
+          <w:tab w:val="num" w:pos="1440"/>
+        </w:tabs>
+        <w:spacing w:before="120" w:after="120" w:line="360" w:lineRule="auto"/>
+        <w:ind w:left="1440"/>
+        <w:rPr>
+          <w:rFonts w:ascii="Times New Roman" w:hAnsi="Times New Roman" w:cs="Times New Roman"/>
+          <w:sz w:val="26"/>
+          <w:szCs w:val="26"/>
+        </w:rPr>
+      </w:pPr>
+      <w:r>
+        <w:rPr>
+          <w:rFonts w:ascii="Times New Roman" w:hAnsi="Times New Roman" w:cs="Times New Roman"/>
+          <w:sz w:val="26"/>
+          <w:szCs w:val="26"/>
+        </w:rPr>
+        <w:t>Cấp 2: Tương tự nhưng n_estimators=200, max_depth=5 (đơn giản hơn vì dữ liệu ít).</w:t>
+      </w:r>
+    </w:p>
+    <w:p>
+      <w:pPr>
+        <w:pStyle w:val="ListParagraph"/>
+        <w:numPr>
+          <w:ilvl w:val="1"/>
+          <w:numId w:val="8"/>
+        </w:numPr>
+        <w:spacing w:before="120" w:after="120" w:line="360" w:lineRule="auto"/>
+        <w:rPr>
+          <w:rFonts w:ascii="Times New Roman" w:hAnsi="Times New Roman" w:cs="Times New Roman"/>
+          <w:sz w:val="26"/>
+          <w:szCs w:val="26"/>
+        </w:rPr>
+      </w:pPr>
+      <w:r>
+        <w:rPr>
+          <w:rFonts w:ascii="Times New Roman" w:hAnsi="Times New Roman" w:cs="Times New Roman"/>
+          <w:sz w:val="26"/>
+          <w:szCs w:val="26"/>
+        </w:rPr>
+        <w:t>Tinh chỉnh hyperparameter: Sử dụng RandomizedSearchCV (n_iter=15, cv=3) trên không gian tham số để tối ưu accuracy.</w:t>
+      </w:r>
+    </w:p>
+    <w:p>
+      <w:pPr>
+        <w:spacing w:before="120" w:after="120" w:line="360" w:lineRule="auto"/>
+        <w:rPr>
+          <w:rFonts w:ascii="Times New Roman" w:hAnsi="Times New Roman" w:cs="Times New Roman"/>
+          <w:sz w:val="26"/>
+          <w:szCs w:val="26"/>
+        </w:rPr>
+      </w:pPr>
+      <w:r>
+        <w:rPr>
+          <w:rFonts w:ascii="Times New Roman" w:hAnsi="Times New Roman" w:cs="Times New Roman"/>
+          <w:b/>
+          <w:bCs/>
+          <w:sz w:val="26"/>
+          <w:szCs w:val="26"/>
+        </w:rPr>
+        <w:t>3.3. Xử lý mất cân bằng dữ liệu:</w:t>
       </w:r>
     </w:p>
     <w:p>
@@ -455,16 +1764,54 @@
           <w:ilvl w:val="0"/>
           <w:numId w:val="3"/>
         </w:numPr>
-      </w:pPr>
-      <w:r>
-        <w:rPr>
+        <w:spacing w:before="120" w:after="120" w:line="360" w:lineRule="auto"/>
+        <w:rPr>
+          <w:rFonts w:ascii="Times New Roman" w:hAnsi="Times New Roman" w:cs="Times New Roman"/>
+          <w:sz w:val="26"/>
+          <w:szCs w:val="26"/>
+        </w:rPr>
+      </w:pPr>
+      <w:r>
+        <w:rPr>
+          <w:rFonts w:ascii="Times New Roman" w:hAnsi="Times New Roman" w:cs="Times New Roman"/>
+          <w:sz w:val="26"/>
+          <w:szCs w:val="26"/>
+        </w:rPr>
+        <w:t>Thay vì tạo dữ liệu tổng hợp (SMOTE) có thể gây nhiễu, phương pháp </w:t>
+      </w:r>
+      <w:r>
+        <w:rPr>
+          <w:rFonts w:ascii="Times New Roman" w:hAnsi="Times New Roman" w:cs="Times New Roman"/>
+          <w:sz w:val="26"/>
+          <w:szCs w:val="26"/>
+        </w:rPr>
+        <w:t>Học</w:t>
+      </w:r>
+      <w:r>
+        <w:rPr>
+          <w:rFonts w:ascii="Times New Roman" w:hAnsi="Times New Roman" w:cs="Times New Roman"/>
           <w:b/>
           <w:bCs/>
-        </w:rPr>
-        <w:t>3.1. Thách thức:</w:t>
-      </w:r>
-      <w:r>
-        <w:t> Bài toán phân loại trực tiếp 55 ngành học gặp khó khăn do số lượng lớp lớn và mất cân bằng, dẫn đến độ chính xác thấp và mô hình thiên vị.</w:t>
+          <w:sz w:val="26"/>
+          <w:szCs w:val="26"/>
+        </w:rPr>
+        <w:t xml:space="preserve"> </w:t>
+      </w:r>
+      <w:r>
+        <w:rPr>
+          <w:rFonts w:ascii="Times New Roman" w:hAnsi="Times New Roman" w:cs="Times New Roman"/>
+          <w:sz w:val="26"/>
+          <w:szCs w:val="26"/>
+        </w:rPr>
+        <w:t>theo chi phí (Cost-Sensitive Learning)</w:t>
+      </w:r>
+      <w:r>
+        <w:rPr>
+          <w:rFonts w:ascii="Times New Roman" w:hAnsi="Times New Roman" w:cs="Times New Roman"/>
+          <w:sz w:val="26"/>
+          <w:szCs w:val="26"/>
+        </w:rPr>
+        <w:t> đã được áp dụng.</w:t>
       </w:r>
     </w:p>
     <w:p>
@@ -473,147 +1820,20 @@
           <w:ilvl w:val="0"/>
           <w:numId w:val="3"/>
         </w:numPr>
-      </w:pPr>
-      <w:r>
-        <w:rPr>
-          <w:b/>
-          <w:bCs/>
-        </w:rPr>
-        <w:t>3.2. Giải pháp kiến trúc: Hệ thống Phân loại Phân tầng (Hierarchical Classification)</w:t>
-      </w:r>
-    </w:p>
-    <w:p>
-      <w:pPr>
-        <w:numPr>
-          <w:ilvl w:val="1"/>
-          <w:numId w:val="3"/>
-        </w:numPr>
-      </w:pPr>
-      <w:r>
-        <w:t>Để giải quyết thách thức trên, một kiến trúc gồm 2 cấp mô hình đã được xây dựng:</w:t>
-      </w:r>
-    </w:p>
-    <w:p>
-      <w:pPr>
-        <w:numPr>
-          <w:ilvl w:val="2"/>
-          <w:numId w:val="3"/>
-        </w:numPr>
-      </w:pPr>
-      <w:r>
-        <w:rPr>
-          <w:b/>
-          <w:bCs/>
-        </w:rPr>
-        <w:t>Mô hình Cấp 1 (Parent Model):</w:t>
-      </w:r>
-    </w:p>
-    <w:p>
-      <w:pPr>
-        <w:numPr>
-          <w:ilvl w:val="3"/>
-          <w:numId w:val="3"/>
-        </w:numPr>
-      </w:pPr>
-      <w:r>
-        <w:rPr>
-          <w:b/>
-          <w:bCs/>
-        </w:rPr>
-        <w:lastRenderedPageBreak/>
-        <w:t>Nhiệm vụ:</w:t>
-      </w:r>
-      <w:r>
-        <w:t> Phân loại dữ liệu đầu vào vào </w:t>
-      </w:r>
-      <w:r>
-        <w:rPr>
-          <w:b/>
-          <w:bCs/>
-        </w:rPr>
-        <w:t>6 "siêu nhóm" lĩnh vực</w:t>
-      </w:r>
-      <w:r>
-        <w:t> (Xã hội - Giáo dục, Khoa học - Y tế, Kinh tế - Kỹ thuật, v.v.). Các nhóm này được tạo ra dựa trên phân tích ma trận nhầm lẫn để gom các lĩnh vực hay bị nhầm lẫn với nhau.</w:t>
-      </w:r>
-    </w:p>
-    <w:p>
-      <w:pPr>
-        <w:numPr>
-          <w:ilvl w:val="3"/>
-          <w:numId w:val="3"/>
-        </w:numPr>
-      </w:pPr>
-      <w:r>
-        <w:rPr>
-          <w:b/>
-          <w:bCs/>
-        </w:rPr>
-        <w:t>Thuật toán:</w:t>
-      </w:r>
-      <w:r>
-        <w:t> XGBoost, được tinh chỉnh bằng RandomizedSearchCV.</w:t>
-      </w:r>
-    </w:p>
-    <w:p>
-      <w:pPr>
-        <w:numPr>
-          <w:ilvl w:val="2"/>
-          <w:numId w:val="3"/>
-        </w:numPr>
-      </w:pPr>
-      <w:r>
-        <w:rPr>
-          <w:b/>
-          <w:bCs/>
-        </w:rPr>
-        <w:t>Các Mô hình Cấp 2 (Child Models):</w:t>
-      </w:r>
-    </w:p>
-    <w:p>
-      <w:pPr>
-        <w:numPr>
-          <w:ilvl w:val="3"/>
-          <w:numId w:val="3"/>
-        </w:numPr>
-      </w:pPr>
-      <w:r>
-        <w:rPr>
-          <w:b/>
-          <w:bCs/>
-        </w:rPr>
-        <w:t>Nhiệm vụ:</w:t>
-      </w:r>
-      <w:r>
-        <w:t> Gồm nhiều mô hình XGBoost chuyên biệt. Mỗi mô hình chỉ được huấn luyện trên dữ liệu của một lĩnh vực và có nhiệm vụ phân biệt các ngành học </w:t>
-      </w:r>
-      <w:r>
-        <w:rPr>
-          <w:b/>
-          <w:bCs/>
-        </w:rPr>
-        <w:t>bên trong</w:t>
-      </w:r>
-      <w:r>
-        <w:t> lĩnh vực đó.</w:t>
-      </w:r>
-    </w:p>
-    <w:p>
-      <w:pPr>
-        <w:numPr>
-          <w:ilvl w:val="3"/>
-          <w:numId w:val="3"/>
-        </w:numPr>
-      </w:pPr>
-      <w:r>
-        <w:rPr>
-          <w:b/>
-          <w:bCs/>
-        </w:rPr>
-        <w:t>Ví dụ:</w:t>
-      </w:r>
-      <w:r>
-        <w:t> Mô hình "Kinh tế - Kỹ thuật" học cách phân biệt giữa 15 ngành như Kỹ thuật cơ khí, Quản trị kinh doanh, Luật...</w:t>
+        <w:spacing w:before="120" w:after="120" w:line="360" w:lineRule="auto"/>
+        <w:rPr>
+          <w:rFonts w:ascii="Times New Roman" w:hAnsi="Times New Roman" w:cs="Times New Roman"/>
+          <w:sz w:val="26"/>
+          <w:szCs w:val="26"/>
+        </w:rPr>
+      </w:pPr>
+      <w:r>
+        <w:rPr>
+          <w:rFonts w:ascii="Times New Roman" w:hAnsi="Times New Roman" w:cs="Times New Roman"/>
+          <w:sz w:val="26"/>
+          <w:szCs w:val="26"/>
+        </w:rPr>
+        <w:t>Sử dụng compute_class_weight của Scikit-learn để tính toán trọng số cho mỗi lớp. Các lớp hiếm hơn sẽ có trọng số cao hơn.</w:t>
       </w:r>
     </w:p>
     <w:p>
@@ -622,71 +1842,50 @@
           <w:ilvl w:val="0"/>
           <w:numId w:val="3"/>
         </w:numPr>
-      </w:pPr>
-      <w:r>
-        <w:rPr>
+        <w:spacing w:before="120" w:after="120" w:line="360" w:lineRule="auto"/>
+        <w:rPr>
+          <w:rFonts w:ascii="Times New Roman" w:hAnsi="Times New Roman" w:cs="Times New Roman"/>
+          <w:sz w:val="26"/>
+          <w:szCs w:val="26"/>
+        </w:rPr>
+      </w:pPr>
+      <w:r>
+        <w:rPr>
+          <w:rFonts w:ascii="Times New Roman" w:hAnsi="Times New Roman" w:cs="Times New Roman"/>
+          <w:sz w:val="26"/>
+          <w:szCs w:val="26"/>
+        </w:rPr>
+        <w:t>Các trọng số này được truyền vào tham số sample_weight của phương thức .fit() trong XGBoost, buộc mô hình phải "phạt" nặng hơn khi dự đoán sai các mẫu thuộc lớp hiếm.</w:t>
+      </w:r>
+    </w:p>
+    <w:p>
+      <w:pPr>
+        <w:spacing w:before="120" w:after="120" w:line="360" w:lineRule="auto"/>
+        <w:rPr>
+          <w:rFonts w:ascii="Times New Roman" w:hAnsi="Times New Roman" w:cs="Times New Roman"/>
+          <w:sz w:val="26"/>
+          <w:szCs w:val="26"/>
+        </w:rPr>
+      </w:pPr>
+      <w:r>
+        <w:rPr>
+          <w:rFonts w:ascii="Times New Roman" w:hAnsi="Times New Roman" w:cs="Times New Roman"/>
           <w:b/>
           <w:bCs/>
-        </w:rPr>
-        <w:t>3.3. Xử lý mất cân bằng dữ liệu:</w:t>
-      </w:r>
-    </w:p>
-    <w:p>
-      <w:pPr>
-        <w:numPr>
-          <w:ilvl w:val="1"/>
-          <w:numId w:val="3"/>
-        </w:numPr>
-      </w:pPr>
-      <w:r>
-        <w:t>Thay vì tạo dữ liệu tổng hợp (SMOTE) có thể gây nhiễu, phương pháp </w:t>
-      </w:r>
-      <w:r>
-        <w:rPr>
+          <w:sz w:val="26"/>
+          <w:szCs w:val="26"/>
+        </w:rPr>
+        <w:t>3.4. Luồng hoạt động</w:t>
+      </w:r>
+      <w:r>
+        <w:rPr>
+          <w:rFonts w:ascii="Times New Roman" w:hAnsi="Times New Roman" w:cs="Times New Roman"/>
           <w:b/>
           <w:bCs/>
-        </w:rPr>
-        <w:t>Học theo chi phí (Cost-Sensitive Learning)</w:t>
-      </w:r>
-      <w:r>
-        <w:t> đã được áp dụng.</w:t>
-      </w:r>
-    </w:p>
-    <w:p>
-      <w:pPr>
-        <w:numPr>
-          <w:ilvl w:val="1"/>
-          <w:numId w:val="3"/>
-        </w:numPr>
-      </w:pPr>
-      <w:r>
-        <w:t>Sử dụng compute_class_weight của Scikit-learn để tính toán trọng số cho mỗi lớp. Các lớp hiếm hơn sẽ có trọng số cao hơn.</w:t>
-      </w:r>
-    </w:p>
-    <w:p>
-      <w:pPr>
-        <w:numPr>
-          <w:ilvl w:val="1"/>
-          <w:numId w:val="3"/>
-        </w:numPr>
-      </w:pPr>
-      <w:r>
-        <w:t>Các trọng số này được truyền vào tham số sample_weight của phương thức .fit() trong XGBoost, buộc mô hình phải "phạt" nặng hơn khi dự đoán sai các mẫu thuộc lớp hiếm.</w:t>
-      </w:r>
-    </w:p>
-    <w:p>
-      <w:pPr>
-        <w:numPr>
-          <w:ilvl w:val="0"/>
-          <w:numId w:val="3"/>
-        </w:numPr>
-      </w:pPr>
-      <w:r>
-        <w:rPr>
-          <w:b/>
-          <w:bCs/>
-        </w:rPr>
-        <w:t>3.4. Luồng hoạt động gợi ý:</w:t>
+          <w:sz w:val="26"/>
+          <w:szCs w:val="26"/>
+        </w:rPr>
+        <w:t>:</w:t>
       </w:r>
     </w:p>
     <w:p>
@@ -695,8 +1894,19 @@
           <w:ilvl w:val="1"/>
           <w:numId w:val="4"/>
         </w:numPr>
-      </w:pPr>
-      <w:r>
+        <w:spacing w:before="120" w:after="120" w:line="360" w:lineRule="auto"/>
+        <w:rPr>
+          <w:rFonts w:ascii="Times New Roman" w:hAnsi="Times New Roman" w:cs="Times New Roman"/>
+          <w:sz w:val="26"/>
+          <w:szCs w:val="26"/>
+        </w:rPr>
+      </w:pPr>
+      <w:r>
+        <w:rPr>
+          <w:rFonts w:ascii="Times New Roman" w:hAnsi="Times New Roman" w:cs="Times New Roman"/>
+          <w:sz w:val="26"/>
+          <w:szCs w:val="26"/>
+        </w:rPr>
         <w:t>Mô hình Cấp 1 dự đoán xác suất cho 6 lĩnh vực.</w:t>
       </w:r>
     </w:p>
@@ -706,18 +1916,35 @@
           <w:ilvl w:val="1"/>
           <w:numId w:val="4"/>
         </w:numPr>
-      </w:pPr>
-      <w:r>
+        <w:spacing w:before="120" w:after="120" w:line="360" w:lineRule="auto"/>
+        <w:rPr>
+          <w:rFonts w:ascii="Times New Roman" w:hAnsi="Times New Roman" w:cs="Times New Roman"/>
+          <w:sz w:val="26"/>
+          <w:szCs w:val="26"/>
+        </w:rPr>
+      </w:pPr>
+      <w:r>
+        <w:rPr>
+          <w:rFonts w:ascii="Times New Roman" w:hAnsi="Times New Roman" w:cs="Times New Roman"/>
+          <w:sz w:val="26"/>
+          <w:szCs w:val="26"/>
+        </w:rPr>
         <w:t>Hệ thống chọn ra </w:t>
       </w:r>
       <w:r>
         <w:rPr>
-          <w:b/>
-          <w:bCs/>
+          <w:rFonts w:ascii="Times New Roman" w:hAnsi="Times New Roman" w:cs="Times New Roman"/>
+          <w:sz w:val="26"/>
+          <w:szCs w:val="26"/>
         </w:rPr>
         <w:t>top 4 lĩnh vực</w:t>
       </w:r>
       <w:r>
+        <w:rPr>
+          <w:rFonts w:ascii="Times New Roman" w:hAnsi="Times New Roman" w:cs="Times New Roman"/>
+          <w:sz w:val="26"/>
+          <w:szCs w:val="26"/>
+        </w:rPr>
         <w:t> có xác suất cao nhất.</w:t>
       </w:r>
     </w:p>
@@ -727,8 +1954,19 @@
           <w:ilvl w:val="1"/>
           <w:numId w:val="4"/>
         </w:numPr>
-      </w:pPr>
-      <w:r>
+        <w:spacing w:before="120" w:after="120" w:line="360" w:lineRule="auto"/>
+        <w:rPr>
+          <w:rFonts w:ascii="Times New Roman" w:hAnsi="Times New Roman" w:cs="Times New Roman"/>
+          <w:sz w:val="26"/>
+          <w:szCs w:val="26"/>
+        </w:rPr>
+      </w:pPr>
+      <w:r>
+        <w:rPr>
+          <w:rFonts w:ascii="Times New Roman" w:hAnsi="Times New Roman" w:cs="Times New Roman"/>
+          <w:sz w:val="26"/>
+          <w:szCs w:val="26"/>
+        </w:rPr>
         <w:t>Các mô hình con tương ứng được kích hoạt để đưa ra top 3 ngành gợi ý trong mỗi lĩnh vực.</w:t>
       </w:r>
     </w:p>
@@ -738,18 +1976,45 @@
           <w:ilvl w:val="1"/>
           <w:numId w:val="4"/>
         </w:numPr>
-      </w:pPr>
-      <w:r>
+        <w:spacing w:before="120" w:after="120" w:line="360" w:lineRule="auto"/>
+        <w:rPr>
+          <w:rFonts w:ascii="Times New Roman" w:hAnsi="Times New Roman" w:cs="Times New Roman"/>
+          <w:sz w:val="26"/>
+          <w:szCs w:val="26"/>
+        </w:rPr>
+      </w:pPr>
+      <w:r>
+        <w:rPr>
+          <w:rFonts w:ascii="Times New Roman" w:hAnsi="Times New Roman" w:cs="Times New Roman"/>
+          <w:sz w:val="26"/>
+          <w:szCs w:val="26"/>
+        </w:rPr>
         <w:t>Một </w:t>
       </w:r>
       <w:r>
         <w:rPr>
+          <w:rFonts w:ascii="Times New Roman" w:hAnsi="Times New Roman" w:cs="Times New Roman"/>
           <w:b/>
           <w:bCs/>
-        </w:rPr>
-        <w:t>"Điểm gợi ý tổng hợp"</w:t>
-      </w:r>
-      <w:r>
+          <w:sz w:val="26"/>
+          <w:szCs w:val="26"/>
+        </w:rPr>
+        <w:t>"</w:t>
+      </w:r>
+      <w:r>
+        <w:rPr>
+          <w:rFonts w:ascii="Times New Roman" w:hAnsi="Times New Roman" w:cs="Times New Roman"/>
+          <w:sz w:val="26"/>
+          <w:szCs w:val="26"/>
+        </w:rPr>
+        <w:t>Điểm gợi ý tổng hợp"</w:t>
+      </w:r>
+      <w:r>
+        <w:rPr>
+          <w:rFonts w:ascii="Times New Roman" w:hAnsi="Times New Roman" w:cs="Times New Roman"/>
+          <w:sz w:val="26"/>
+          <w:szCs w:val="26"/>
+        </w:rPr>
         <w:t> được tính cho mỗi ngành ứng cử viên (Điểm = Xác suất lĩnh vực * Xác suất ngành con).</w:t>
       </w:r>
     </w:p>
@@ -759,45 +2024,76 @@
           <w:ilvl w:val="1"/>
           <w:numId w:val="4"/>
         </w:numPr>
-      </w:pPr>
-      <w:r>
-        <w:t>Danh sách tất cả các ứng cử viên được sắp xếp dựa trên điểm số này để tạo ra </w:t>
-      </w:r>
-      <w:r>
-        <w:rPr>
+        <w:spacing w:before="120" w:after="120" w:line="360" w:lineRule="auto"/>
+        <w:rPr>
+          <w:rFonts w:ascii="Times New Roman" w:hAnsi="Times New Roman" w:cs="Times New Roman"/>
+          <w:sz w:val="26"/>
+          <w:szCs w:val="26"/>
+        </w:rPr>
+      </w:pPr>
+      <w:r>
+        <w:rPr>
+          <w:rFonts w:ascii="Times New Roman" w:hAnsi="Times New Roman" w:cs="Times New Roman"/>
+          <w:sz w:val="26"/>
+          <w:szCs w:val="26"/>
+        </w:rPr>
+        <w:t xml:space="preserve">Danh sách tất cả các ứng cử viên được sắp xếp dựa trên điểm số này để tạo </w:t>
+      </w:r>
+      <w:r>
+        <w:rPr>
+          <w:rFonts w:ascii="Times New Roman" w:hAnsi="Times New Roman" w:cs="Times New Roman"/>
+          <w:sz w:val="26"/>
+          <w:szCs w:val="26"/>
+        </w:rPr>
+        <w:t>ra top 5 gợi ý cuối cùng</w:t>
+      </w:r>
+      <w:r>
+        <w:rPr>
+          <w:rFonts w:ascii="Times New Roman" w:hAnsi="Times New Roman" w:cs="Times New Roman"/>
+          <w:sz w:val="26"/>
+          <w:szCs w:val="26"/>
+        </w:rPr>
+        <w:t> cho người dùng.</w:t>
+      </w:r>
+    </w:p>
+    <w:p>
+      <w:pPr>
+        <w:spacing w:before="120" w:after="120" w:line="360" w:lineRule="auto"/>
+        <w:rPr>
+          <w:rFonts w:ascii="Times New Roman" w:hAnsi="Times New Roman" w:cs="Times New Roman"/>
           <w:b/>
           <w:bCs/>
-        </w:rPr>
-        <w:t>top 5 gợi ý cuối cùng</w:t>
-      </w:r>
-      <w:r>
-        <w:t> cho người dùng.</w:t>
-      </w:r>
-    </w:p>
-    <w:p>
-      <w:r>
-        <w:pict w14:anchorId="4B8D9970">
-          <v:rect id="_x0000_i1065" style="width:664.2pt;height:1.5pt" o:hrpct="0" o:hralign="center" o:hrstd="t" o:hr="t" fillcolor="#a0a0a0" stroked="f"/>
-        </w:pict>
-      </w:r>
-    </w:p>
-    <w:p>
-      <w:pPr>
-        <w:rPr>
+          <w:sz w:val="26"/>
+          <w:szCs w:val="26"/>
+        </w:rPr>
+      </w:pPr>
+      <w:r>
+        <w:rPr>
+          <w:rFonts w:ascii="Times New Roman" w:hAnsi="Times New Roman" w:cs="Times New Roman"/>
           <w:b/>
           <w:bCs/>
-        </w:rPr>
-      </w:pPr>
-      <w:r>
-        <w:rPr>
-          <w:b/>
-          <w:bCs/>
+          <w:sz w:val="26"/>
+          <w:szCs w:val="26"/>
         </w:rPr>
         <w:t>4. KẾT QUẢ VÀ ĐÁNH GIÁ</w:t>
       </w:r>
     </w:p>
     <w:p>
-      <w:r>
+      <w:pPr>
+        <w:spacing w:before="120" w:after="120" w:line="360" w:lineRule="auto"/>
+        <w:ind w:firstLine="720"/>
+        <w:rPr>
+          <w:rFonts w:ascii="Times New Roman" w:hAnsi="Times New Roman" w:cs="Times New Roman"/>
+          <w:sz w:val="26"/>
+          <w:szCs w:val="26"/>
+        </w:rPr>
+      </w:pPr>
+      <w:r>
+        <w:rPr>
+          <w:rFonts w:ascii="Times New Roman" w:hAnsi="Times New Roman" w:cs="Times New Roman"/>
+          <w:sz w:val="26"/>
+          <w:szCs w:val="26"/>
+        </w:rPr>
         <w:lastRenderedPageBreak/>
         <w:t>Do đây là một hệ thống gợi ý, việc đánh giá chỉ dựa trên accuracy (Top-1) là không đầy đủ. Chúng tôi đã sử dụng một bộ chỉ số toàn diện hơn:</w:t>
       </w:r>
@@ -806,6 +2102,14 @@
       <w:tblPr>
         <w:tblW w:w="0" w:type="auto"/>
         <w:tblCellSpacing w:w="15" w:type="dxa"/>
+        <w:tblBorders>
+          <w:top w:val="single" w:sz="4" w:space="0" w:color="auto"/>
+          <w:left w:val="single" w:sz="4" w:space="0" w:color="auto"/>
+          <w:bottom w:val="single" w:sz="4" w:space="0" w:color="auto"/>
+          <w:right w:val="single" w:sz="4" w:space="0" w:color="auto"/>
+          <w:insideH w:val="single" w:sz="4" w:space="0" w:color="auto"/>
+          <w:insideV w:val="single" w:sz="4" w:space="0" w:color="auto"/>
+        </w:tblBorders>
         <w:tblCellMar>
           <w:top w:w="15" w:type="dxa"/>
           <w:left w:w="15" w:type="dxa"/>
@@ -815,9 +2119,9 @@
         <w:tblLook w:val="04A0" w:firstRow="1" w:lastRow="0" w:firstColumn="1" w:lastColumn="0" w:noHBand="0" w:noVBand="1"/>
       </w:tblPr>
       <w:tblGrid>
-        <w:gridCol w:w="1559"/>
-        <w:gridCol w:w="1063"/>
-        <w:gridCol w:w="6738"/>
+        <w:gridCol w:w="1661"/>
+        <w:gridCol w:w="1158"/>
+        <w:gridCol w:w="6531"/>
       </w:tblGrid>
       <w:tr>
         <w:trPr>
@@ -826,10 +2130,6 @@
         <w:tc>
           <w:tcPr>
             <w:tcW w:w="0" w:type="auto"/>
-            <w:tcBorders>
-              <w:top w:val="nil"/>
-              <w:right w:val="nil"/>
-            </w:tcBorders>
             <w:tcMar>
               <w:top w:w="90" w:type="dxa"/>
               <w:left w:w="180" w:type="dxa"/>
@@ -841,15 +2141,22 @@
           </w:tcPr>
           <w:p>
             <w:pPr>
+              <w:spacing w:before="120" w:after="120" w:line="360" w:lineRule="auto"/>
               <w:rPr>
+                <w:rFonts w:ascii="Times New Roman" w:hAnsi="Times New Roman" w:cs="Times New Roman"/>
                 <w:b/>
                 <w:bCs/>
+                <w:sz w:val="26"/>
+                <w:szCs w:val="26"/>
               </w:rPr>
             </w:pPr>
             <w:r>
               <w:rPr>
+                <w:rFonts w:ascii="Times New Roman" w:hAnsi="Times New Roman" w:cs="Times New Roman"/>
                 <w:b/>
                 <w:bCs/>
+                <w:sz w:val="26"/>
+                <w:szCs w:val="26"/>
               </w:rPr>
               <w:t>Chỉ Số</w:t>
             </w:r>
@@ -858,10 +2165,6 @@
         <w:tc>
           <w:tcPr>
             <w:tcW w:w="0" w:type="auto"/>
-            <w:tcBorders>
-              <w:top w:val="nil"/>
-              <w:right w:val="nil"/>
-            </w:tcBorders>
             <w:tcMar>
               <w:top w:w="90" w:type="dxa"/>
               <w:left w:w="180" w:type="dxa"/>
@@ -873,15 +2176,22 @@
           </w:tcPr>
           <w:p>
             <w:pPr>
+              <w:spacing w:before="120" w:after="120" w:line="360" w:lineRule="auto"/>
               <w:rPr>
+                <w:rFonts w:ascii="Times New Roman" w:hAnsi="Times New Roman" w:cs="Times New Roman"/>
                 <w:b/>
                 <w:bCs/>
+                <w:sz w:val="26"/>
+                <w:szCs w:val="26"/>
               </w:rPr>
             </w:pPr>
             <w:r>
               <w:rPr>
+                <w:rFonts w:ascii="Times New Roman" w:hAnsi="Times New Roman" w:cs="Times New Roman"/>
                 <w:b/>
                 <w:bCs/>
+                <w:sz w:val="26"/>
+                <w:szCs w:val="26"/>
               </w:rPr>
               <w:t>Giá Trị</w:t>
             </w:r>
@@ -890,10 +2200,6 @@
         <w:tc>
           <w:tcPr>
             <w:tcW w:w="0" w:type="auto"/>
-            <w:tcBorders>
-              <w:top w:val="nil"/>
-              <w:right w:val="nil"/>
-            </w:tcBorders>
             <w:tcMar>
               <w:top w:w="90" w:type="dxa"/>
               <w:left w:w="180" w:type="dxa"/>
@@ -905,17 +2211,24 @@
           </w:tcPr>
           <w:p>
             <w:pPr>
+              <w:spacing w:before="120" w:after="120" w:line="360" w:lineRule="auto"/>
               <w:rPr>
+                <w:rFonts w:ascii="Times New Roman" w:hAnsi="Times New Roman" w:cs="Times New Roman"/>
                 <w:b/>
                 <w:bCs/>
+                <w:sz w:val="26"/>
+                <w:szCs w:val="26"/>
               </w:rPr>
             </w:pPr>
             <w:r>
               <w:rPr>
+                <w:rFonts w:ascii="Times New Roman" w:hAnsi="Times New Roman" w:cs="Times New Roman"/>
                 <w:b/>
                 <w:bCs/>
+                <w:sz w:val="26"/>
+                <w:szCs w:val="26"/>
               </w:rPr>
-              <w:t>Diễn Giải</w:t>
+              <w:t>Giải thich</w:t>
             </w:r>
           </w:p>
         </w:tc>
@@ -927,9 +2240,6 @@
         <w:tc>
           <w:tcPr>
             <w:tcW w:w="0" w:type="auto"/>
-            <w:tcBorders>
-              <w:right w:val="nil"/>
-            </w:tcBorders>
             <w:tcMar>
               <w:top w:w="90" w:type="dxa"/>
               <w:left w:w="180" w:type="dxa"/>
@@ -940,10 +2250,19 @@
             <w:hideMark/>
           </w:tcPr>
           <w:p>
+            <w:pPr>
+              <w:spacing w:before="120" w:after="120" w:line="360" w:lineRule="auto"/>
+              <w:rPr>
+                <w:rFonts w:ascii="Times New Roman" w:hAnsi="Times New Roman" w:cs="Times New Roman"/>
+                <w:sz w:val="26"/>
+                <w:szCs w:val="26"/>
+              </w:rPr>
+            </w:pPr>
             <w:r>
               <w:rPr>
-                <w:b/>
-                <w:bCs/>
+                <w:rFonts w:ascii="Times New Roman" w:hAnsi="Times New Roman" w:cs="Times New Roman"/>
+                <w:sz w:val="26"/>
+                <w:szCs w:val="26"/>
               </w:rPr>
               <w:t>Top-1 Accuracy</w:t>
             </w:r>
@@ -952,9 +2271,6 @@
         <w:tc>
           <w:tcPr>
             <w:tcW w:w="0" w:type="auto"/>
-            <w:tcBorders>
-              <w:right w:val="nil"/>
-            </w:tcBorders>
             <w:tcMar>
               <w:top w:w="90" w:type="dxa"/>
               <w:left w:w="180" w:type="dxa"/>
@@ -965,10 +2281,19 @@
             <w:hideMark/>
           </w:tcPr>
           <w:p>
+            <w:pPr>
+              <w:spacing w:before="120" w:after="120" w:line="360" w:lineRule="auto"/>
+              <w:rPr>
+                <w:rFonts w:ascii="Times New Roman" w:hAnsi="Times New Roman" w:cs="Times New Roman"/>
+                <w:sz w:val="26"/>
+                <w:szCs w:val="26"/>
+              </w:rPr>
+            </w:pPr>
             <w:r>
               <w:rPr>
-                <w:b/>
-                <w:bCs/>
+                <w:rFonts w:ascii="Times New Roman" w:hAnsi="Times New Roman" w:cs="Times New Roman"/>
+                <w:sz w:val="26"/>
+                <w:szCs w:val="26"/>
               </w:rPr>
               <w:t>0.1771</w:t>
             </w:r>
@@ -977,9 +2302,6 @@
         <w:tc>
           <w:tcPr>
             <w:tcW w:w="0" w:type="auto"/>
-            <w:tcBorders>
-              <w:right w:val="nil"/>
-            </w:tcBorders>
             <w:tcMar>
               <w:top w:w="90" w:type="dxa"/>
               <w:left w:w="180" w:type="dxa"/>
@@ -990,7 +2312,20 @@
             <w:hideMark/>
           </w:tcPr>
           <w:p>
+            <w:pPr>
+              <w:spacing w:before="120" w:after="120" w:line="360" w:lineRule="auto"/>
+              <w:rPr>
+                <w:rFonts w:ascii="Times New Roman" w:hAnsi="Times New Roman" w:cs="Times New Roman"/>
+                <w:sz w:val="26"/>
+                <w:szCs w:val="26"/>
+              </w:rPr>
+            </w:pPr>
             <w:r>
+              <w:rPr>
+                <w:rFonts w:ascii="Times New Roman" w:hAnsi="Times New Roman" w:cs="Times New Roman"/>
+                <w:sz w:val="26"/>
+                <w:szCs w:val="26"/>
+              </w:rPr>
               <w:t>Tỷ lệ dự đoán đúng ngay từ gợi ý đầu tiên. Con số này thấp là có thể dự đoán được do độ khó của bài toán.</w:t>
             </w:r>
           </w:p>
@@ -1003,9 +2338,6 @@
         <w:tc>
           <w:tcPr>
             <w:tcW w:w="0" w:type="auto"/>
-            <w:tcBorders>
-              <w:right w:val="nil"/>
-            </w:tcBorders>
             <w:tcMar>
               <w:top w:w="90" w:type="dxa"/>
               <w:left w:w="180" w:type="dxa"/>
@@ -1016,10 +2348,19 @@
             <w:hideMark/>
           </w:tcPr>
           <w:p>
+            <w:pPr>
+              <w:spacing w:before="120" w:after="120" w:line="360" w:lineRule="auto"/>
+              <w:rPr>
+                <w:rFonts w:ascii="Times New Roman" w:hAnsi="Times New Roman" w:cs="Times New Roman"/>
+                <w:sz w:val="26"/>
+                <w:szCs w:val="26"/>
+              </w:rPr>
+            </w:pPr>
             <w:r>
               <w:rPr>
-                <w:b/>
-                <w:bCs/>
+                <w:rFonts w:ascii="Times New Roman" w:hAnsi="Times New Roman" w:cs="Times New Roman"/>
+                <w:sz w:val="26"/>
+                <w:szCs w:val="26"/>
               </w:rPr>
               <w:t>Top-3 Accuracy</w:t>
             </w:r>
@@ -1028,9 +2369,6 @@
         <w:tc>
           <w:tcPr>
             <w:tcW w:w="0" w:type="auto"/>
-            <w:tcBorders>
-              <w:right w:val="nil"/>
-            </w:tcBorders>
             <w:tcMar>
               <w:top w:w="90" w:type="dxa"/>
               <w:left w:w="180" w:type="dxa"/>
@@ -1041,10 +2379,19 @@
             <w:hideMark/>
           </w:tcPr>
           <w:p>
+            <w:pPr>
+              <w:spacing w:before="120" w:after="120" w:line="360" w:lineRule="auto"/>
+              <w:rPr>
+                <w:rFonts w:ascii="Times New Roman" w:hAnsi="Times New Roman" w:cs="Times New Roman"/>
+                <w:sz w:val="26"/>
+                <w:szCs w:val="26"/>
+              </w:rPr>
+            </w:pPr>
             <w:r>
               <w:rPr>
-                <w:b/>
-                <w:bCs/>
+                <w:rFonts w:ascii="Times New Roman" w:hAnsi="Times New Roman" w:cs="Times New Roman"/>
+                <w:sz w:val="26"/>
+                <w:szCs w:val="26"/>
               </w:rPr>
               <w:t>0.4094</w:t>
             </w:r>
@@ -1053,9 +2400,6 @@
         <w:tc>
           <w:tcPr>
             <w:tcW w:w="0" w:type="auto"/>
-            <w:tcBorders>
-              <w:right w:val="nil"/>
-            </w:tcBorders>
             <w:tcMar>
               <w:top w:w="90" w:type="dxa"/>
               <w:left w:w="180" w:type="dxa"/>
@@ -1066,14 +2410,28 @@
             <w:hideMark/>
           </w:tcPr>
           <w:p>
+            <w:pPr>
+              <w:spacing w:before="120" w:after="120" w:line="360" w:lineRule="auto"/>
+              <w:rPr>
+                <w:rFonts w:ascii="Times New Roman" w:hAnsi="Times New Roman" w:cs="Times New Roman"/>
+                <w:sz w:val="26"/>
+                <w:szCs w:val="26"/>
+              </w:rPr>
+            </w:pPr>
             <w:r>
               <w:rPr>
-                <w:b/>
-                <w:bCs/>
+                <w:rFonts w:ascii="Times New Roman" w:hAnsi="Times New Roman" w:cs="Times New Roman"/>
+                <w:sz w:val="26"/>
+                <w:szCs w:val="26"/>
               </w:rPr>
               <w:t>40.9%</w:t>
             </w:r>
             <w:r>
+              <w:rPr>
+                <w:rFonts w:ascii="Times New Roman" w:hAnsi="Times New Roman" w:cs="Times New Roman"/>
+                <w:sz w:val="26"/>
+                <w:szCs w:val="26"/>
+              </w:rPr>
               <w:t> người dùng tìm thấy ngành phù hợp của họ trong top 3 gợi ý.</w:t>
             </w:r>
           </w:p>
@@ -1086,9 +2444,6 @@
         <w:tc>
           <w:tcPr>
             <w:tcW w:w="0" w:type="auto"/>
-            <w:tcBorders>
-              <w:right w:val="nil"/>
-            </w:tcBorders>
             <w:tcMar>
               <w:top w:w="90" w:type="dxa"/>
               <w:left w:w="180" w:type="dxa"/>
@@ -1099,10 +2454,19 @@
             <w:hideMark/>
           </w:tcPr>
           <w:p>
+            <w:pPr>
+              <w:spacing w:before="120" w:after="120" w:line="360" w:lineRule="auto"/>
+              <w:rPr>
+                <w:rFonts w:ascii="Times New Roman" w:hAnsi="Times New Roman" w:cs="Times New Roman"/>
+                <w:sz w:val="26"/>
+                <w:szCs w:val="26"/>
+              </w:rPr>
+            </w:pPr>
             <w:r>
               <w:rPr>
-                <w:b/>
-                <w:bCs/>
+                <w:rFonts w:ascii="Times New Roman" w:hAnsi="Times New Roman" w:cs="Times New Roman"/>
+                <w:sz w:val="26"/>
+                <w:szCs w:val="26"/>
               </w:rPr>
               <w:t>Top-5 Accuracy</w:t>
             </w:r>
@@ -1111,9 +2475,6 @@
         <w:tc>
           <w:tcPr>
             <w:tcW w:w="0" w:type="auto"/>
-            <w:tcBorders>
-              <w:right w:val="nil"/>
-            </w:tcBorders>
             <w:tcMar>
               <w:top w:w="90" w:type="dxa"/>
               <w:left w:w="180" w:type="dxa"/>
@@ -1124,10 +2485,19 @@
             <w:hideMark/>
           </w:tcPr>
           <w:p>
+            <w:pPr>
+              <w:spacing w:before="120" w:after="120" w:line="360" w:lineRule="auto"/>
+              <w:rPr>
+                <w:rFonts w:ascii="Times New Roman" w:hAnsi="Times New Roman" w:cs="Times New Roman"/>
+                <w:sz w:val="26"/>
+                <w:szCs w:val="26"/>
+              </w:rPr>
+            </w:pPr>
             <w:r>
               <w:rPr>
-                <w:b/>
-                <w:bCs/>
+                <w:rFonts w:ascii="Times New Roman" w:hAnsi="Times New Roman" w:cs="Times New Roman"/>
+                <w:sz w:val="26"/>
+                <w:szCs w:val="26"/>
               </w:rPr>
               <w:t>0.5506</w:t>
             </w:r>
@@ -1136,9 +2506,6 @@
         <w:tc>
           <w:tcPr>
             <w:tcW w:w="0" w:type="auto"/>
-            <w:tcBorders>
-              <w:right w:val="nil"/>
-            </w:tcBorders>
             <w:tcMar>
               <w:top w:w="90" w:type="dxa"/>
               <w:left w:w="180" w:type="dxa"/>
@@ -1149,14 +2516,28 @@
             <w:hideMark/>
           </w:tcPr>
           <w:p>
+            <w:pPr>
+              <w:spacing w:before="120" w:after="120" w:line="360" w:lineRule="auto"/>
+              <w:rPr>
+                <w:rFonts w:ascii="Times New Roman" w:hAnsi="Times New Roman" w:cs="Times New Roman"/>
+                <w:sz w:val="26"/>
+                <w:szCs w:val="26"/>
+              </w:rPr>
+            </w:pPr>
             <w:r>
               <w:rPr>
-                <w:b/>
-                <w:bCs/>
+                <w:rFonts w:ascii="Times New Roman" w:hAnsi="Times New Roman" w:cs="Times New Roman"/>
+                <w:sz w:val="26"/>
+                <w:szCs w:val="26"/>
               </w:rPr>
               <w:t>55.1%</w:t>
             </w:r>
             <w:r>
+              <w:rPr>
+                <w:rFonts w:ascii="Times New Roman" w:hAnsi="Times New Roman" w:cs="Times New Roman"/>
+                <w:sz w:val="26"/>
+                <w:szCs w:val="26"/>
+              </w:rPr>
               <w:t> người dùng tìm thấy ngành phù hợp của họ trong top 5 gợi ý. Đây là một chỉ số rất khả quan, cho thấy tính hữu ích của hệ thống.</w:t>
             </w:r>
           </w:p>
@@ -1169,9 +2550,6 @@
         <w:tc>
           <w:tcPr>
             <w:tcW w:w="0" w:type="auto"/>
-            <w:tcBorders>
-              <w:right w:val="nil"/>
-            </w:tcBorders>
             <w:tcMar>
               <w:top w:w="90" w:type="dxa"/>
               <w:left w:w="180" w:type="dxa"/>
@@ -1182,10 +2560,19 @@
             <w:hideMark/>
           </w:tcPr>
           <w:p>
+            <w:pPr>
+              <w:spacing w:before="120" w:after="120" w:line="360" w:lineRule="auto"/>
+              <w:rPr>
+                <w:rFonts w:ascii="Times New Roman" w:hAnsi="Times New Roman" w:cs="Times New Roman"/>
+                <w:sz w:val="26"/>
+                <w:szCs w:val="26"/>
+              </w:rPr>
+            </w:pPr>
             <w:r>
               <w:rPr>
-                <w:b/>
-                <w:bCs/>
+                <w:rFonts w:ascii="Times New Roman" w:hAnsi="Times New Roman" w:cs="Times New Roman"/>
+                <w:sz w:val="26"/>
+                <w:szCs w:val="26"/>
               </w:rPr>
               <w:t>MRR</w:t>
             </w:r>
@@ -1194,9 +2581,6 @@
         <w:tc>
           <w:tcPr>
             <w:tcW w:w="0" w:type="auto"/>
-            <w:tcBorders>
-              <w:right w:val="nil"/>
-            </w:tcBorders>
             <w:tcMar>
               <w:top w:w="90" w:type="dxa"/>
               <w:left w:w="180" w:type="dxa"/>
@@ -1207,10 +2591,19 @@
             <w:hideMark/>
           </w:tcPr>
           <w:p>
+            <w:pPr>
+              <w:spacing w:before="120" w:after="120" w:line="360" w:lineRule="auto"/>
+              <w:rPr>
+                <w:rFonts w:ascii="Times New Roman" w:hAnsi="Times New Roman" w:cs="Times New Roman"/>
+                <w:sz w:val="26"/>
+                <w:szCs w:val="26"/>
+              </w:rPr>
+            </w:pPr>
             <w:r>
               <w:rPr>
-                <w:b/>
-                <w:bCs/>
+                <w:rFonts w:ascii="Times New Roman" w:hAnsi="Times New Roman" w:cs="Times New Roman"/>
+                <w:sz w:val="26"/>
+                <w:szCs w:val="26"/>
               </w:rPr>
               <w:t>0.3090</w:t>
             </w:r>
@@ -1219,9 +2612,6 @@
         <w:tc>
           <w:tcPr>
             <w:tcW w:w="0" w:type="auto"/>
-            <w:tcBorders>
-              <w:right w:val="nil"/>
-            </w:tcBorders>
             <w:tcMar>
               <w:top w:w="90" w:type="dxa"/>
               <w:left w:w="180" w:type="dxa"/>
@@ -1232,7 +2622,20 @@
             <w:hideMark/>
           </w:tcPr>
           <w:p>
+            <w:pPr>
+              <w:spacing w:before="120" w:after="120" w:line="360" w:lineRule="auto"/>
+              <w:rPr>
+                <w:rFonts w:ascii="Times New Roman" w:hAnsi="Times New Roman" w:cs="Times New Roman"/>
+                <w:sz w:val="26"/>
+                <w:szCs w:val="26"/>
+              </w:rPr>
+            </w:pPr>
             <w:r>
+              <w:rPr>
+                <w:rFonts w:ascii="Times New Roman" w:hAnsi="Times New Roman" w:cs="Times New Roman"/>
+                <w:sz w:val="26"/>
+                <w:szCs w:val="26"/>
+              </w:rPr>
               <w:t>Thứ hạng trung bình của gợi ý đúng là khoảng vị trí thứ 3, cho thấy chất lượng xếp hạng tốt.</w:t>
             </w:r>
           </w:p>
@@ -1245,9 +2648,6 @@
         <w:tc>
           <w:tcPr>
             <w:tcW w:w="0" w:type="auto"/>
-            <w:tcBorders>
-              <w:right w:val="nil"/>
-            </w:tcBorders>
             <w:tcMar>
               <w:top w:w="90" w:type="dxa"/>
               <w:left w:w="180" w:type="dxa"/>
@@ -1258,10 +2658,19 @@
             <w:hideMark/>
           </w:tcPr>
           <w:p>
+            <w:pPr>
+              <w:spacing w:before="120" w:after="120" w:line="360" w:lineRule="auto"/>
+              <w:rPr>
+                <w:rFonts w:ascii="Times New Roman" w:hAnsi="Times New Roman" w:cs="Times New Roman"/>
+                <w:sz w:val="26"/>
+                <w:szCs w:val="26"/>
+              </w:rPr>
+            </w:pPr>
             <w:r>
               <w:rPr>
-                <w:b/>
-                <w:bCs/>
+                <w:rFonts w:ascii="Times New Roman" w:hAnsi="Times New Roman" w:cs="Times New Roman"/>
+                <w:sz w:val="26"/>
+                <w:szCs w:val="26"/>
               </w:rPr>
               <w:t>Coverage</w:t>
             </w:r>
@@ -1270,9 +2679,6 @@
         <w:tc>
           <w:tcPr>
             <w:tcW w:w="0" w:type="auto"/>
-            <w:tcBorders>
-              <w:right w:val="nil"/>
-            </w:tcBorders>
             <w:tcMar>
               <w:top w:w="90" w:type="dxa"/>
               <w:left w:w="180" w:type="dxa"/>
@@ -1283,10 +2689,19 @@
             <w:hideMark/>
           </w:tcPr>
           <w:p>
+            <w:pPr>
+              <w:spacing w:before="120" w:after="120" w:line="360" w:lineRule="auto"/>
+              <w:rPr>
+                <w:rFonts w:ascii="Times New Roman" w:hAnsi="Times New Roman" w:cs="Times New Roman"/>
+                <w:sz w:val="26"/>
+                <w:szCs w:val="26"/>
+              </w:rPr>
+            </w:pPr>
             <w:r>
               <w:rPr>
-                <w:b/>
-                <w:bCs/>
+                <w:rFonts w:ascii="Times New Roman" w:hAnsi="Times New Roman" w:cs="Times New Roman"/>
+                <w:sz w:val="26"/>
+                <w:szCs w:val="26"/>
               </w:rPr>
               <w:t>1.0000</w:t>
             </w:r>
@@ -1295,9 +2710,6 @@
         <w:tc>
           <w:tcPr>
             <w:tcW w:w="0" w:type="auto"/>
-            <w:tcBorders>
-              <w:right w:val="nil"/>
-            </w:tcBorders>
             <w:tcMar>
               <w:top w:w="90" w:type="dxa"/>
               <w:left w:w="180" w:type="dxa"/>
@@ -1308,24 +2720,36 @@
             <w:hideMark/>
           </w:tcPr>
           <w:p>
+            <w:pPr>
+              <w:spacing w:before="120" w:after="120" w:line="360" w:lineRule="auto"/>
+              <w:rPr>
+                <w:rFonts w:ascii="Times New Roman" w:hAnsi="Times New Roman" w:cs="Times New Roman"/>
+                <w:sz w:val="26"/>
+                <w:szCs w:val="26"/>
+              </w:rPr>
+            </w:pPr>
             <w:r>
               <w:rPr>
-                <w:b/>
-                <w:bCs/>
+                <w:rFonts w:ascii="Times New Roman" w:hAnsi="Times New Roman" w:cs="Times New Roman"/>
+                <w:sz w:val="26"/>
+                <w:szCs w:val="26"/>
               </w:rPr>
-              <w:t>Thành công lớn:</w:t>
-            </w:r>
-            <w:r>
-              <w:t> Hệ thống có khả năng gợi ý được </w:t>
+              <w:t>Hệ thống có khả năng gợi ý được </w:t>
             </w:r>
             <w:r>
               <w:rPr>
-                <w:b/>
-                <w:bCs/>
+                <w:rFonts w:ascii="Times New Roman" w:hAnsi="Times New Roman" w:cs="Times New Roman"/>
+                <w:sz w:val="26"/>
+                <w:szCs w:val="26"/>
               </w:rPr>
               <w:t>100%</w:t>
             </w:r>
             <w:r>
+              <w:rPr>
+                <w:rFonts w:ascii="Times New Roman" w:hAnsi="Times New Roman" w:cs="Times New Roman"/>
+                <w:sz w:val="26"/>
+                <w:szCs w:val="26"/>
+              </w:rPr>
               <w:t> các ngành có trong dữ liệu, chứng tỏ đã khắc phục triệt để vấn đề mất cân bằng.</w:t>
             </w:r>
           </w:p>
@@ -1338,9 +2762,6 @@
         <w:tc>
           <w:tcPr>
             <w:tcW w:w="0" w:type="auto"/>
-            <w:tcBorders>
-              <w:right w:val="nil"/>
-            </w:tcBorders>
             <w:tcMar>
               <w:top w:w="90" w:type="dxa"/>
               <w:left w:w="180" w:type="dxa"/>
@@ -1351,10 +2772,19 @@
             <w:hideMark/>
           </w:tcPr>
           <w:p>
+            <w:pPr>
+              <w:spacing w:before="120" w:after="120" w:line="360" w:lineRule="auto"/>
+              <w:rPr>
+                <w:rFonts w:ascii="Times New Roman" w:hAnsi="Times New Roman" w:cs="Times New Roman"/>
+                <w:sz w:val="26"/>
+                <w:szCs w:val="26"/>
+              </w:rPr>
+            </w:pPr>
             <w:r>
               <w:rPr>
-                <w:b/>
-                <w:bCs/>
+                <w:rFonts w:ascii="Times New Roman" w:hAnsi="Times New Roman" w:cs="Times New Roman"/>
+                <w:sz w:val="26"/>
+                <w:szCs w:val="26"/>
               </w:rPr>
               <w:t>Diversity</w:t>
             </w:r>
@@ -1363,9 +2793,6 @@
         <w:tc>
           <w:tcPr>
             <w:tcW w:w="0" w:type="auto"/>
-            <w:tcBorders>
-              <w:right w:val="nil"/>
-            </w:tcBorders>
             <w:tcMar>
               <w:top w:w="90" w:type="dxa"/>
               <w:left w:w="180" w:type="dxa"/>
@@ -1376,10 +2803,19 @@
             <w:hideMark/>
           </w:tcPr>
           <w:p>
+            <w:pPr>
+              <w:spacing w:before="120" w:after="120" w:line="360" w:lineRule="auto"/>
+              <w:rPr>
+                <w:rFonts w:ascii="Times New Roman" w:hAnsi="Times New Roman" w:cs="Times New Roman"/>
+                <w:sz w:val="26"/>
+                <w:szCs w:val="26"/>
+              </w:rPr>
+            </w:pPr>
             <w:r>
               <w:rPr>
-                <w:b/>
-                <w:bCs/>
+                <w:rFonts w:ascii="Times New Roman" w:hAnsi="Times New Roman" w:cs="Times New Roman"/>
+                <w:sz w:val="26"/>
+                <w:szCs w:val="26"/>
               </w:rPr>
               <w:t>3.8278</w:t>
             </w:r>
@@ -1388,9 +2824,6 @@
         <w:tc>
           <w:tcPr>
             <w:tcW w:w="0" w:type="auto"/>
-            <w:tcBorders>
-              <w:right w:val="nil"/>
-            </w:tcBorders>
             <w:tcMar>
               <w:top w:w="90" w:type="dxa"/>
               <w:left w:w="180" w:type="dxa"/>
@@ -1401,17 +2834,36 @@
             <w:hideMark/>
           </w:tcPr>
           <w:p>
+            <w:pPr>
+              <w:spacing w:before="120" w:after="120" w:line="360" w:lineRule="auto"/>
+              <w:rPr>
+                <w:rFonts w:ascii="Times New Roman" w:hAnsi="Times New Roman" w:cs="Times New Roman"/>
+                <w:sz w:val="26"/>
+                <w:szCs w:val="26"/>
+              </w:rPr>
+            </w:pPr>
             <w:r>
+              <w:rPr>
+                <w:rFonts w:ascii="Times New Roman" w:hAnsi="Times New Roman" w:cs="Times New Roman"/>
+                <w:sz w:val="26"/>
+                <w:szCs w:val="26"/>
+              </w:rPr>
               <w:t>Trung bình mỗi danh sách gợi ý đến từ gần </w:t>
             </w:r>
             <w:r>
               <w:rPr>
-                <w:b/>
-                <w:bCs/>
+                <w:rFonts w:ascii="Times New Roman" w:hAnsi="Times New Roman" w:cs="Times New Roman"/>
+                <w:sz w:val="26"/>
+                <w:szCs w:val="26"/>
               </w:rPr>
               <w:t>4 lĩnh vực khác nhau</w:t>
             </w:r>
             <w:r>
+              <w:rPr>
+                <w:rFonts w:ascii="Times New Roman" w:hAnsi="Times New Roman" w:cs="Times New Roman"/>
+                <w:sz w:val="26"/>
+                <w:szCs w:val="26"/>
+              </w:rPr>
               <w:t>, cho thấy hệ thống có tính khám phá cao.</w:t>
             </w:r>
           </w:p>
@@ -1419,10 +2871,19 @@
       </w:tr>
     </w:tbl>
     <w:p>
-      <w:r>
-        <w:rPr>
-          <w:b/>
-          <w:bCs/>
+      <w:pPr>
+        <w:spacing w:before="120" w:after="120" w:line="360" w:lineRule="auto"/>
+        <w:rPr>
+          <w:rFonts w:ascii="Times New Roman" w:hAnsi="Times New Roman" w:cs="Times New Roman"/>
+          <w:sz w:val="26"/>
+          <w:szCs w:val="26"/>
+        </w:rPr>
+      </w:pPr>
+      <w:r>
+        <w:rPr>
+          <w:rFonts w:ascii="Times New Roman" w:hAnsi="Times New Roman" w:cs="Times New Roman"/>
+          <w:sz w:val="26"/>
+          <w:szCs w:val="26"/>
         </w:rPr>
         <w:t>Phân tích mô hình:</w:t>
       </w:r>
@@ -1433,26 +2894,29 @@
           <w:ilvl w:val="0"/>
           <w:numId w:val="5"/>
         </w:numPr>
-      </w:pPr>
-      <w:r>
-        <w:rPr>
-          <w:b/>
-          <w:bCs/>
-        </w:rPr>
-        <w:t>Mô hình Cấp 1:</w:t>
-      </w:r>
-      <w:r>
-        <w:t> Đạt </w:t>
-      </w:r>
-      <w:r>
-        <w:rPr>
-          <w:b/>
-          <w:bCs/>
-        </w:rPr>
-        <w:t>Top-3 Accuracy 80.1%</w:t>
-      </w:r>
-      <w:r>
-        <w:t>, chứng tỏ khả năng "định tuyến" đến đúng nhóm lĩnh vực là rất đáng tin cậy.</w:t>
+        <w:spacing w:before="120" w:after="120" w:line="360" w:lineRule="auto"/>
+        <w:rPr>
+          <w:rFonts w:ascii="Times New Roman" w:hAnsi="Times New Roman" w:cs="Times New Roman"/>
+          <w:sz w:val="26"/>
+          <w:szCs w:val="26"/>
+        </w:rPr>
+      </w:pPr>
+      <w:r>
+        <w:rPr>
+          <w:rFonts w:ascii="Times New Roman" w:hAnsi="Times New Roman" w:cs="Times New Roman"/>
+          <w:sz w:val="26"/>
+          <w:szCs w:val="26"/>
+        </w:rPr>
+        <w:lastRenderedPageBreak/>
+        <w:t>Mô hình Cấp 1: Đạt Top-3 Accuracy 80.1%,</w:t>
+      </w:r>
+      <w:r>
+        <w:rPr>
+          <w:rFonts w:ascii="Times New Roman" w:hAnsi="Times New Roman" w:cs="Times New Roman"/>
+          <w:sz w:val="26"/>
+          <w:szCs w:val="26"/>
+        </w:rPr>
+        <w:t xml:space="preserve"> chứng tỏ khả năng "định tuyến" đến đúng nhóm lĩnh vực là rất đáng tin cậy.</w:t>
       </w:r>
     </w:p>
     <w:p>
@@ -1461,36 +2925,58 @@
           <w:ilvl w:val="0"/>
           <w:numId w:val="5"/>
         </w:numPr>
-      </w:pPr>
-      <w:r>
-        <w:rPr>
+        <w:spacing w:before="120" w:after="120" w:line="360" w:lineRule="auto"/>
+        <w:rPr>
+          <w:rFonts w:ascii="Times New Roman" w:hAnsi="Times New Roman" w:cs="Times New Roman"/>
+          <w:sz w:val="26"/>
+          <w:szCs w:val="26"/>
+        </w:rPr>
+      </w:pPr>
+      <w:r>
+        <w:rPr>
+          <w:rFonts w:ascii="Times New Roman" w:hAnsi="Times New Roman" w:cs="Times New Roman"/>
+          <w:sz w:val="26"/>
+          <w:szCs w:val="26"/>
+        </w:rPr>
+        <w:t>Mô hình Cấp 2</w:t>
+      </w:r>
+      <w:r>
+        <w:rPr>
+          <w:rFonts w:ascii="Times New Roman" w:hAnsi="Times New Roman" w:cs="Times New Roman"/>
           <w:b/>
           <w:bCs/>
-        </w:rPr>
-        <w:t>Mô hình Cấp 2:</w:t>
-      </w:r>
-      <w:r>
+          <w:sz w:val="26"/>
+          <w:szCs w:val="26"/>
+        </w:rPr>
+        <w:t>:</w:t>
+      </w:r>
+      <w:r>
+        <w:rPr>
+          <w:rFonts w:ascii="Times New Roman" w:hAnsi="Times New Roman" w:cs="Times New Roman"/>
+          <w:sz w:val="26"/>
+          <w:szCs w:val="26"/>
+        </w:rPr>
         <w:t> Hiệu suất đa dạng, các mô hình con cho lĩnh vực đặc thù (Y tế, Xây dựng) đạt độ chính xác rất cao (&gt;98%), trong khi các mô hình cho lĩnh vực rộng (Kinh tế - Kỹ thuật) có độ chính xác thấp hơn do sự chồng chéo lớn giữa các ngành con. Tuy nhiên, khi kết hợp trong hệ thống tổng thể, chúng vẫn đóng góp hiệu quả vào việc xếp hạng.</w:t>
       </w:r>
     </w:p>
     <w:p>
-      <w:r>
-        <w:pict w14:anchorId="1244356F">
-          <v:rect id="_x0000_i1066" style="width:664.2pt;height:1.5pt" o:hrpct="0" o:hralign="center" o:hrstd="t" o:hr="t" fillcolor="#a0a0a0" stroked="f"/>
-        </w:pict>
-      </w:r>
-    </w:p>
-    <w:p>
-      <w:pPr>
-        <w:rPr>
+      <w:pPr>
+        <w:spacing w:before="120" w:after="120" w:line="360" w:lineRule="auto"/>
+        <w:rPr>
+          <w:rFonts w:ascii="Times New Roman" w:hAnsi="Times New Roman" w:cs="Times New Roman"/>
           <w:b/>
           <w:bCs/>
-        </w:rPr>
-      </w:pPr>
-      <w:r>
-        <w:rPr>
+          <w:sz w:val="26"/>
+          <w:szCs w:val="26"/>
+        </w:rPr>
+      </w:pPr>
+      <w:r>
+        <w:rPr>
+          <w:rFonts w:ascii="Times New Roman" w:hAnsi="Times New Roman" w:cs="Times New Roman"/>
           <w:b/>
           <w:bCs/>
+          <w:sz w:val="26"/>
+          <w:szCs w:val="26"/>
         </w:rPr>
         <w:t>5. KẾT LUẬN VÀ HƯỚNG PHÁT TRIỂN</w:t>
       </w:r>
@@ -1501,13 +2987,30 @@
           <w:ilvl w:val="0"/>
           <w:numId w:val="6"/>
         </w:numPr>
-      </w:pPr>
-      <w:r>
-        <w:rPr>
+        <w:spacing w:before="120" w:after="120" w:line="360" w:lineRule="auto"/>
+        <w:rPr>
+          <w:rFonts w:ascii="Times New Roman" w:hAnsi="Times New Roman" w:cs="Times New Roman"/>
+          <w:sz w:val="26"/>
+          <w:szCs w:val="26"/>
+        </w:rPr>
+      </w:pPr>
+      <w:r>
+        <w:rPr>
+          <w:rFonts w:ascii="Times New Roman" w:hAnsi="Times New Roman" w:cs="Times New Roman"/>
+          <w:sz w:val="26"/>
+          <w:szCs w:val="26"/>
+        </w:rPr>
+        <w:t>Kết luận</w:t>
+      </w:r>
+      <w:r>
+        <w:rPr>
+          <w:rFonts w:ascii="Times New Roman" w:hAnsi="Times New Roman" w:cs="Times New Roman"/>
           <w:b/>
           <w:bCs/>
-        </w:rPr>
-        <w:t>Kết luận:</w:t>
+          <w:sz w:val="26"/>
+          <w:szCs w:val="26"/>
+        </w:rPr>
+        <w:t>:</w:t>
       </w:r>
     </w:p>
     <w:p>
@@ -1516,9 +3019,19 @@
           <w:ilvl w:val="1"/>
           <w:numId w:val="6"/>
         </w:numPr>
-      </w:pPr>
-      <w:r>
-        <w:lastRenderedPageBreak/>
+        <w:spacing w:before="120" w:after="120" w:line="360" w:lineRule="auto"/>
+        <w:rPr>
+          <w:rFonts w:ascii="Times New Roman" w:hAnsi="Times New Roman" w:cs="Times New Roman"/>
+          <w:sz w:val="26"/>
+          <w:szCs w:val="26"/>
+        </w:rPr>
+      </w:pPr>
+      <w:r>
+        <w:rPr>
+          <w:rFonts w:ascii="Times New Roman" w:hAnsi="Times New Roman" w:cs="Times New Roman"/>
+          <w:sz w:val="26"/>
+          <w:szCs w:val="26"/>
+        </w:rPr>
         <w:t>Dự án đã xây dựng thành công một hệ thống gợi ý ngành học phân tầng, giải quyết hiệu quả bài toán có số lượng lớp lớn và dữ liệu mất cân bằng.</w:t>
       </w:r>
     </w:p>
@@ -1528,19 +3041,36 @@
           <w:ilvl w:val="1"/>
           <w:numId w:val="6"/>
         </w:numPr>
-      </w:pPr>
-      <w:r>
+        <w:spacing w:before="120" w:after="120" w:line="360" w:lineRule="auto"/>
+        <w:rPr>
+          <w:rFonts w:ascii="Times New Roman" w:hAnsi="Times New Roman" w:cs="Times New Roman"/>
+          <w:sz w:val="26"/>
+          <w:szCs w:val="26"/>
+        </w:rPr>
+      </w:pPr>
+      <w:r>
+        <w:rPr>
+          <w:rFonts w:ascii="Times New Roman" w:hAnsi="Times New Roman" w:cs="Times New Roman"/>
+          <w:sz w:val="26"/>
+          <w:szCs w:val="26"/>
+        </w:rPr>
         <w:t>Các chỉ số đánh giá (đặc biệt là Top-5 Accuracy, Coverage và Diversity) cho thấy mô hình không chỉ có độ chính xác chấp nhận được mà còn </w:t>
       </w:r>
       <w:r>
         <w:rPr>
-          <w:b/>
-          <w:bCs/>
-        </w:rPr>
-        <w:t>công bằng, toàn diện và hữu ích</w:t>
-      </w:r>
-      <w:r>
-        <w:t> cho người dùng trong việc khám phá lựa chọn nghề nghiệp.</w:t>
+          <w:rFonts w:ascii="Times New Roman" w:hAnsi="Times New Roman" w:cs="Times New Roman"/>
+          <w:sz w:val="26"/>
+          <w:szCs w:val="26"/>
+        </w:rPr>
+        <w:t>công bằng, toàn diện và hữu ích </w:t>
+      </w:r>
+      <w:r>
+        <w:rPr>
+          <w:rFonts w:ascii="Times New Roman" w:hAnsi="Times New Roman" w:cs="Times New Roman"/>
+          <w:sz w:val="26"/>
+          <w:szCs w:val="26"/>
+        </w:rPr>
+        <w:t>cho người dùng trong việc khám phá lựa chọn nghề nghiệp.</w:t>
       </w:r>
     </w:p>
     <w:p>
@@ -1549,8 +3079,19 @@
           <w:ilvl w:val="1"/>
           <w:numId w:val="6"/>
         </w:numPr>
-      </w:pPr>
-      <w:r>
+        <w:spacing w:before="120" w:after="120" w:line="360" w:lineRule="auto"/>
+        <w:rPr>
+          <w:rFonts w:ascii="Times New Roman" w:hAnsi="Times New Roman" w:cs="Times New Roman"/>
+          <w:sz w:val="26"/>
+          <w:szCs w:val="26"/>
+        </w:rPr>
+      </w:pPr>
+      <w:r>
+        <w:rPr>
+          <w:rFonts w:ascii="Times New Roman" w:hAnsi="Times New Roman" w:cs="Times New Roman"/>
+          <w:sz w:val="26"/>
+          <w:szCs w:val="26"/>
+        </w:rPr>
         <w:t>Hệ thống đã sẵn sàng để triển khai trên môi trường thực tế dưới dạng một công cụ tư vấn.</w:t>
       </w:r>
     </w:p>
@@ -1560,11 +3101,18 @@
           <w:ilvl w:val="0"/>
           <w:numId w:val="6"/>
         </w:numPr>
-      </w:pPr>
-      <w:r>
-        <w:rPr>
-          <w:b/>
-          <w:bCs/>
+        <w:spacing w:before="120" w:after="120" w:line="360" w:lineRule="auto"/>
+        <w:rPr>
+          <w:rFonts w:ascii="Times New Roman" w:hAnsi="Times New Roman" w:cs="Times New Roman"/>
+          <w:sz w:val="26"/>
+          <w:szCs w:val="26"/>
+        </w:rPr>
+      </w:pPr>
+      <w:r>
+        <w:rPr>
+          <w:rFonts w:ascii="Times New Roman" w:hAnsi="Times New Roman" w:cs="Times New Roman"/>
+          <w:sz w:val="26"/>
+          <w:szCs w:val="26"/>
         </w:rPr>
         <w:t>Hướng phát triển trong tương lai:</w:t>
       </w:r>
@@ -1575,15 +3123,27 @@
           <w:ilvl w:val="1"/>
           <w:numId w:val="6"/>
         </w:numPr>
-      </w:pPr>
-      <w:r>
-        <w:rPr>
-          <w:b/>
-          <w:bCs/>
+        <w:spacing w:before="120" w:after="120" w:line="360" w:lineRule="auto"/>
+        <w:rPr>
+          <w:rFonts w:ascii="Times New Roman" w:hAnsi="Times New Roman" w:cs="Times New Roman"/>
+          <w:sz w:val="26"/>
+          <w:szCs w:val="26"/>
+        </w:rPr>
+      </w:pPr>
+      <w:r>
+        <w:rPr>
+          <w:rFonts w:ascii="Times New Roman" w:hAnsi="Times New Roman" w:cs="Times New Roman"/>
+          <w:sz w:val="26"/>
+          <w:szCs w:val="26"/>
         </w:rPr>
         <w:t>Tinh chỉnh các mô hình con:</w:t>
       </w:r>
       <w:r>
+        <w:rPr>
+          <w:rFonts w:ascii="Times New Roman" w:hAnsi="Times New Roman" w:cs="Times New Roman"/>
+          <w:sz w:val="26"/>
+          <w:szCs w:val="26"/>
+        </w:rPr>
         <w:t> Tiếp tục tối ưu hóa các mô hình con có hiệu suất chưa cao bằng các thuật toán khác (ví dụ: CatBoost) hoặc tinh chỉnh siêu tham số chuyên sâu hơn.</w:t>
       </w:r>
     </w:p>
@@ -1593,15 +3153,37 @@
           <w:ilvl w:val="1"/>
           <w:numId w:val="6"/>
         </w:numPr>
-      </w:pPr>
-      <w:r>
-        <w:rPr>
+        <w:spacing w:before="120" w:after="120" w:line="360" w:lineRule="auto"/>
+        <w:rPr>
+          <w:rFonts w:ascii="Times New Roman" w:hAnsi="Times New Roman" w:cs="Times New Roman"/>
+          <w:sz w:val="26"/>
+          <w:szCs w:val="26"/>
+        </w:rPr>
+      </w:pPr>
+      <w:r>
+        <w:rPr>
+          <w:rFonts w:ascii="Times New Roman" w:hAnsi="Times New Roman" w:cs="Times New Roman"/>
+          <w:sz w:val="26"/>
+          <w:szCs w:val="26"/>
+        </w:rPr>
+        <w:t>Làm giàu trải nghiệm người dùng</w:t>
+      </w:r>
+      <w:r>
+        <w:rPr>
+          <w:rFonts w:ascii="Times New Roman" w:hAnsi="Times New Roman" w:cs="Times New Roman"/>
           <w:b/>
           <w:bCs/>
-        </w:rPr>
-        <w:t>Làm giàu trải nghiệm người dùng:</w:t>
-      </w:r>
-      <w:r>
+          <w:sz w:val="26"/>
+          <w:szCs w:val="26"/>
+        </w:rPr>
+        <w:t>:</w:t>
+      </w:r>
+      <w:r>
+        <w:rPr>
+          <w:rFonts w:ascii="Times New Roman" w:hAnsi="Times New Roman" w:cs="Times New Roman"/>
+          <w:sz w:val="26"/>
+          <w:szCs w:val="26"/>
+        </w:rPr>
         <w:t> Tích hợp logic hậu xử lý để tăng tính đa dạng của gợi ý, đồng thời hiển thị thêm thông tin "tại sao" ngành đó được gợi ý (dựa trên hồ sơ RIASEC).</w:t>
       </w:r>
     </w:p>
@@ -1611,19 +3193,41 @@
           <w:ilvl w:val="1"/>
           <w:numId w:val="6"/>
         </w:numPr>
-      </w:pPr>
-      <w:r>
-        <w:rPr>
-          <w:b/>
-          <w:bCs/>
-        </w:rPr>
+        <w:spacing w:before="120" w:after="120" w:line="360" w:lineRule="auto"/>
+        <w:rPr>
+          <w:rFonts w:ascii="Times New Roman" w:hAnsi="Times New Roman" w:cs="Times New Roman"/>
+          <w:sz w:val="26"/>
+          <w:szCs w:val="26"/>
+        </w:rPr>
+      </w:pPr>
+      <w:r>
+        <w:rPr>
+          <w:rFonts w:ascii="Times New Roman" w:hAnsi="Times New Roman" w:cs="Times New Roman"/>
+          <w:sz w:val="26"/>
+          <w:szCs w:val="26"/>
+        </w:rPr>
+        <w:lastRenderedPageBreak/>
         <w:t>Xây dựng vòng lặp phản hồi (Feedback Loop):</w:t>
       </w:r>
       <w:r>
+        <w:rPr>
+          <w:rFonts w:ascii="Times New Roman" w:hAnsi="Times New Roman" w:cs="Times New Roman"/>
+          <w:sz w:val="26"/>
+          <w:szCs w:val="26"/>
+        </w:rPr>
         <w:t> Thu thập phản hồi từ người dùng trên website để liên tục cải thiện và huấn luyện lại mô hình trong tương lai.</w:t>
       </w:r>
     </w:p>
-    <w:p/>
+    <w:p>
+      <w:pPr>
+        <w:spacing w:before="120" w:after="120" w:line="360" w:lineRule="auto"/>
+        <w:rPr>
+          <w:rFonts w:ascii="Times New Roman" w:hAnsi="Times New Roman" w:cs="Times New Roman"/>
+          <w:sz w:val="26"/>
+          <w:szCs w:val="26"/>
+        </w:rPr>
+      </w:pPr>
+    </w:p>
     <w:sectPr>
       <w:pgSz w:w="12240" w:h="15840"/>
       <w:pgMar w:top="1440" w:right="1440" w:bottom="1440" w:left="1440" w:header="708" w:footer="708" w:gutter="0"/>
@@ -1786,6 +3390,268 @@
     </w:lvl>
   </w:abstractNum>
   <w:abstractNum w:abstractNumId="1" w15:restartNumberingAfterBreak="0">
+    <w:nsid w:val="0B211A38"/>
+    <w:multiLevelType w:val="multilevel"/>
+    <w:tmpl w:val="136A1EC2"/>
+    <w:lvl w:ilvl="0">
+      <w:start w:val="1"/>
+      <w:numFmt w:val="bullet"/>
+      <w:lvlText w:val=""/>
+      <w:lvlJc w:val="left"/>
+      <w:pPr>
+        <w:tabs>
+          <w:tab w:val="num" w:pos="720"/>
+        </w:tabs>
+        <w:ind w:left="720" w:hanging="360"/>
+      </w:pPr>
+      <w:rPr>
+        <w:rFonts w:ascii="Symbol" w:hAnsi="Symbol" w:hint="default"/>
+        <w:sz w:val="20"/>
+      </w:rPr>
+    </w:lvl>
+    <w:lvl w:ilvl="1">
+      <w:start w:val="1"/>
+      <w:numFmt w:val="bullet"/>
+      <w:lvlText w:val="o"/>
+      <w:lvlJc w:val="left"/>
+      <w:pPr>
+        <w:tabs>
+          <w:tab w:val="num" w:pos="1440"/>
+        </w:tabs>
+        <w:ind w:left="1440" w:hanging="360"/>
+      </w:pPr>
+      <w:rPr>
+        <w:rFonts w:ascii="Courier New" w:hAnsi="Courier New" w:hint="default"/>
+        <w:sz w:val="20"/>
+      </w:rPr>
+    </w:lvl>
+    <w:lvl w:ilvl="2" w:tentative="1">
+      <w:start w:val="1"/>
+      <w:numFmt w:val="bullet"/>
+      <w:lvlText w:val=""/>
+      <w:lvlJc w:val="left"/>
+      <w:pPr>
+        <w:tabs>
+          <w:tab w:val="num" w:pos="2160"/>
+        </w:tabs>
+        <w:ind w:left="2160" w:hanging="360"/>
+      </w:pPr>
+      <w:rPr>
+        <w:rFonts w:ascii="Wingdings" w:hAnsi="Wingdings" w:hint="default"/>
+        <w:sz w:val="20"/>
+      </w:rPr>
+    </w:lvl>
+    <w:lvl w:ilvl="3" w:tentative="1">
+      <w:start w:val="1"/>
+      <w:numFmt w:val="bullet"/>
+      <w:lvlText w:val=""/>
+      <w:lvlJc w:val="left"/>
+      <w:pPr>
+        <w:tabs>
+          <w:tab w:val="num" w:pos="2880"/>
+        </w:tabs>
+        <w:ind w:left="2880" w:hanging="360"/>
+      </w:pPr>
+      <w:rPr>
+        <w:rFonts w:ascii="Wingdings" w:hAnsi="Wingdings" w:hint="default"/>
+        <w:sz w:val="20"/>
+      </w:rPr>
+    </w:lvl>
+    <w:lvl w:ilvl="4" w:tentative="1">
+      <w:start w:val="1"/>
+      <w:numFmt w:val="bullet"/>
+      <w:lvlText w:val=""/>
+      <w:lvlJc w:val="left"/>
+      <w:pPr>
+        <w:tabs>
+          <w:tab w:val="num" w:pos="3600"/>
+        </w:tabs>
+        <w:ind w:left="3600" w:hanging="360"/>
+      </w:pPr>
+      <w:rPr>
+        <w:rFonts w:ascii="Wingdings" w:hAnsi="Wingdings" w:hint="default"/>
+        <w:sz w:val="20"/>
+      </w:rPr>
+    </w:lvl>
+    <w:lvl w:ilvl="5" w:tentative="1">
+      <w:start w:val="1"/>
+      <w:numFmt w:val="bullet"/>
+      <w:lvlText w:val=""/>
+      <w:lvlJc w:val="left"/>
+      <w:pPr>
+        <w:tabs>
+          <w:tab w:val="num" w:pos="4320"/>
+        </w:tabs>
+        <w:ind w:left="4320" w:hanging="360"/>
+      </w:pPr>
+      <w:rPr>
+        <w:rFonts w:ascii="Wingdings" w:hAnsi="Wingdings" w:hint="default"/>
+        <w:sz w:val="20"/>
+      </w:rPr>
+    </w:lvl>
+    <w:lvl w:ilvl="6" w:tentative="1">
+      <w:start w:val="1"/>
+      <w:numFmt w:val="bullet"/>
+      <w:lvlText w:val=""/>
+      <w:lvlJc w:val="left"/>
+      <w:pPr>
+        <w:tabs>
+          <w:tab w:val="num" w:pos="5040"/>
+        </w:tabs>
+        <w:ind w:left="5040" w:hanging="360"/>
+      </w:pPr>
+      <w:rPr>
+        <w:rFonts w:ascii="Wingdings" w:hAnsi="Wingdings" w:hint="default"/>
+        <w:sz w:val="20"/>
+      </w:rPr>
+    </w:lvl>
+    <w:lvl w:ilvl="7" w:tentative="1">
+      <w:start w:val="1"/>
+      <w:numFmt w:val="bullet"/>
+      <w:lvlText w:val=""/>
+      <w:lvlJc w:val="left"/>
+      <w:pPr>
+        <w:tabs>
+          <w:tab w:val="num" w:pos="5760"/>
+        </w:tabs>
+        <w:ind w:left="5760" w:hanging="360"/>
+      </w:pPr>
+      <w:rPr>
+        <w:rFonts w:ascii="Wingdings" w:hAnsi="Wingdings" w:hint="default"/>
+        <w:sz w:val="20"/>
+      </w:rPr>
+    </w:lvl>
+    <w:lvl w:ilvl="8" w:tentative="1">
+      <w:start w:val="1"/>
+      <w:numFmt w:val="bullet"/>
+      <w:lvlText w:val=""/>
+      <w:lvlJc w:val="left"/>
+      <w:pPr>
+        <w:tabs>
+          <w:tab w:val="num" w:pos="6480"/>
+        </w:tabs>
+        <w:ind w:left="6480" w:hanging="360"/>
+      </w:pPr>
+      <w:rPr>
+        <w:rFonts w:ascii="Wingdings" w:hAnsi="Wingdings" w:hint="default"/>
+        <w:sz w:val="20"/>
+      </w:rPr>
+    </w:lvl>
+  </w:abstractNum>
+  <w:abstractNum w:abstractNumId="2" w15:restartNumberingAfterBreak="0">
+    <w:nsid w:val="1AB65FC2"/>
+    <w:multiLevelType w:val="hybridMultilevel"/>
+    <w:tmpl w:val="C25CFACC"/>
+    <w:lvl w:ilvl="0" w:tplc="A656B5A4">
+      <w:start w:val="2"/>
+      <w:numFmt w:val="bullet"/>
+      <w:lvlText w:val="-"/>
+      <w:lvlJc w:val="left"/>
+      <w:pPr>
+        <w:ind w:left="720" w:hanging="360"/>
+      </w:pPr>
+      <w:rPr>
+        <w:rFonts w:ascii="Calibri" w:eastAsiaTheme="minorHAnsi" w:hAnsi="Calibri" w:cs="Calibri" w:hint="default"/>
+      </w:rPr>
+    </w:lvl>
+    <w:lvl w:ilvl="1" w:tplc="04090003">
+      <w:start w:val="1"/>
+      <w:numFmt w:val="bullet"/>
+      <w:lvlText w:val="o"/>
+      <w:lvlJc w:val="left"/>
+      <w:pPr>
+        <w:ind w:left="1440" w:hanging="360"/>
+      </w:pPr>
+      <w:rPr>
+        <w:rFonts w:ascii="Courier New" w:hAnsi="Courier New" w:cs="Courier New" w:hint="default"/>
+      </w:rPr>
+    </w:lvl>
+    <w:lvl w:ilvl="2" w:tplc="04090005">
+      <w:start w:val="1"/>
+      <w:numFmt w:val="bullet"/>
+      <w:lvlText w:val=""/>
+      <w:lvlJc w:val="left"/>
+      <w:pPr>
+        <w:ind w:left="2160" w:hanging="360"/>
+      </w:pPr>
+      <w:rPr>
+        <w:rFonts w:ascii="Wingdings" w:hAnsi="Wingdings" w:hint="default"/>
+      </w:rPr>
+    </w:lvl>
+    <w:lvl w:ilvl="3" w:tplc="04090001">
+      <w:start w:val="1"/>
+      <w:numFmt w:val="bullet"/>
+      <w:lvlText w:val=""/>
+      <w:lvlJc w:val="left"/>
+      <w:pPr>
+        <w:ind w:left="2880" w:hanging="360"/>
+      </w:pPr>
+      <w:rPr>
+        <w:rFonts w:ascii="Symbol" w:hAnsi="Symbol" w:hint="default"/>
+      </w:rPr>
+    </w:lvl>
+    <w:lvl w:ilvl="4" w:tplc="04090003" w:tentative="1">
+      <w:start w:val="1"/>
+      <w:numFmt w:val="bullet"/>
+      <w:lvlText w:val="o"/>
+      <w:lvlJc w:val="left"/>
+      <w:pPr>
+        <w:ind w:left="3600" w:hanging="360"/>
+      </w:pPr>
+      <w:rPr>
+        <w:rFonts w:ascii="Courier New" w:hAnsi="Courier New" w:cs="Courier New" w:hint="default"/>
+      </w:rPr>
+    </w:lvl>
+    <w:lvl w:ilvl="5" w:tplc="04090005" w:tentative="1">
+      <w:start w:val="1"/>
+      <w:numFmt w:val="bullet"/>
+      <w:lvlText w:val=""/>
+      <w:lvlJc w:val="left"/>
+      <w:pPr>
+        <w:ind w:left="4320" w:hanging="360"/>
+      </w:pPr>
+      <w:rPr>
+        <w:rFonts w:ascii="Wingdings" w:hAnsi="Wingdings" w:hint="default"/>
+      </w:rPr>
+    </w:lvl>
+    <w:lvl w:ilvl="6" w:tplc="04090001" w:tentative="1">
+      <w:start w:val="1"/>
+      <w:numFmt w:val="bullet"/>
+      <w:lvlText w:val=""/>
+      <w:lvlJc w:val="left"/>
+      <w:pPr>
+        <w:ind w:left="5040" w:hanging="360"/>
+      </w:pPr>
+      <w:rPr>
+        <w:rFonts w:ascii="Symbol" w:hAnsi="Symbol" w:hint="default"/>
+      </w:rPr>
+    </w:lvl>
+    <w:lvl w:ilvl="7" w:tplc="04090003" w:tentative="1">
+      <w:start w:val="1"/>
+      <w:numFmt w:val="bullet"/>
+      <w:lvlText w:val="o"/>
+      <w:lvlJc w:val="left"/>
+      <w:pPr>
+        <w:ind w:left="5760" w:hanging="360"/>
+      </w:pPr>
+      <w:rPr>
+        <w:rFonts w:ascii="Courier New" w:hAnsi="Courier New" w:cs="Courier New" w:hint="default"/>
+      </w:rPr>
+    </w:lvl>
+    <w:lvl w:ilvl="8" w:tplc="04090005" w:tentative="1">
+      <w:start w:val="1"/>
+      <w:numFmt w:val="bullet"/>
+      <w:lvlText w:val=""/>
+      <w:lvlJc w:val="left"/>
+      <w:pPr>
+        <w:ind w:left="6480" w:hanging="360"/>
+      </w:pPr>
+      <w:rPr>
+        <w:rFonts w:ascii="Wingdings" w:hAnsi="Wingdings" w:hint="default"/>
+      </w:rPr>
+    </w:lvl>
+  </w:abstractNum>
+  <w:abstractNum w:abstractNumId="3" w15:restartNumberingAfterBreak="0">
     <w:nsid w:val="256972CD"/>
     <w:multiLevelType w:val="multilevel"/>
     <w:tmpl w:val="EE0E22C2"/>
@@ -1934,7 +3800,7 @@
       </w:rPr>
     </w:lvl>
   </w:abstractNum>
-  <w:abstractNum w:abstractNumId="2" w15:restartNumberingAfterBreak="0">
+  <w:abstractNum w:abstractNumId="4" w15:restartNumberingAfterBreak="0">
     <w:nsid w:val="4B4F6926"/>
     <w:multiLevelType w:val="multilevel"/>
     <w:tmpl w:val="54D62D7A"/>
@@ -2079,7 +3945,7 @@
       </w:rPr>
     </w:lvl>
   </w:abstractNum>
-  <w:abstractNum w:abstractNumId="3" w15:restartNumberingAfterBreak="0">
+  <w:abstractNum w:abstractNumId="5" w15:restartNumberingAfterBreak="0">
     <w:nsid w:val="59916A81"/>
     <w:multiLevelType w:val="multilevel"/>
     <w:tmpl w:val="52FAD00E"/>
@@ -2228,7 +4094,7 @@
       </w:rPr>
     </w:lvl>
   </w:abstractNum>
-  <w:abstractNum w:abstractNumId="4" w15:restartNumberingAfterBreak="0">
+  <w:abstractNum w:abstractNumId="6" w15:restartNumberingAfterBreak="0">
     <w:nsid w:val="69187855"/>
     <w:multiLevelType w:val="multilevel"/>
     <w:tmpl w:val="547ED156"/>
@@ -2378,16 +4244,16 @@
     </w:lvl>
   </w:abstractNum>
   <w:num w:numId="1" w16cid:durableId="607928218">
+    <w:abstractNumId w:val="5"/>
+  </w:num>
+  <w:num w:numId="2" w16cid:durableId="1930844187">
     <w:abstractNumId w:val="3"/>
   </w:num>
-  <w:num w:numId="2" w16cid:durableId="1930844187">
-    <w:abstractNumId w:val="1"/>
-  </w:num>
   <w:num w:numId="3" w16cid:durableId="1970741911">
-    <w:abstractNumId w:val="2"/>
+    <w:abstractNumId w:val="4"/>
   </w:num>
   <w:num w:numId="4" w16cid:durableId="1081490466">
-    <w:abstractNumId w:val="2"/>
+    <w:abstractNumId w:val="4"/>
     <w:lvlOverride w:ilvl="1">
       <w:lvl w:ilvl="1">
         <w:numFmt w:val="decimal"/>
@@ -2400,7 +4266,13 @@
     <w:abstractNumId w:val="0"/>
   </w:num>
   <w:num w:numId="6" w16cid:durableId="954867521">
-    <w:abstractNumId w:val="4"/>
+    <w:abstractNumId w:val="6"/>
+  </w:num>
+  <w:num w:numId="7" w16cid:durableId="1019431232">
+    <w:abstractNumId w:val="2"/>
+  </w:num>
+  <w:num w:numId="8" w16cid:durableId="514463515">
+    <w:abstractNumId w:val="1"/>
   </w:num>
 </w:numbering>
 </file>
@@ -3321,6 +5193,29 @@
       <w:spacing w:val="5"/>
     </w:rPr>
   </w:style>
+  <w:style w:type="character" w:styleId="Hyperlink">
+    <w:name w:val="Hyperlink"/>
+    <w:basedOn w:val="DefaultParagraphFont"/>
+    <w:uiPriority w:val="99"/>
+    <w:unhideWhenUsed/>
+    <w:rsid w:val="00E70E24"/>
+    <w:rPr>
+      <w:color w:val="0563C1" w:themeColor="hyperlink"/>
+      <w:u w:val="single"/>
+    </w:rPr>
+  </w:style>
+  <w:style w:type="character" w:styleId="UnresolvedMention">
+    <w:name w:val="Unresolved Mention"/>
+    <w:basedOn w:val="DefaultParagraphFont"/>
+    <w:uiPriority w:val="99"/>
+    <w:semiHidden/>
+    <w:unhideWhenUsed/>
+    <w:rsid w:val="00E70E24"/>
+    <w:rPr>
+      <w:color w:val="605E5C"/>
+      <w:shd w:val="clear" w:color="auto" w:fill="E1DFDD"/>
+    </w:rPr>
+  </w:style>
 </w:styles>
 </file>
 

</xml_diff>